<commit_message>
feat: new changes on docs, final
</commit_message>
<xml_diff>
--- a/05_entrega_final/documento_final_abnt_v2.docx
+++ b/05_entrega_final/documento_final_abnt_v2.docx
@@ -343,18 +343,20 @@
       <w:r>
         <w:rPr/>
       </w:r>
-      <w:r>
-        <w:br w:type="page"/>
-      </w:r>
-    </w:p>
-    <w:p>
-      <w:pPr>
-        <w:pStyle w:val="Heading1"/>
-        <w:pBdr>
-          <w:bottom w:val="single" w:sz="10" w:space="4" w:color="2E6DA4"/>
-        </w:pBdr>
-        <w:spacing w:before="0" w:after="200"/>
-        <w:rPr/>
+    </w:p>
+    <w:p>
+      <w:pPr>
+        <w:pStyle w:val="Normal"/>
+        <w:spacing w:before="0" w:after="240"/>
+        <w:jc w:val="center"/>
+        <w:rPr>
+          <w:rFonts w:ascii="Arial" w:hAnsi="Arial" w:eastAsia="Arial" w:cs="Arial"/>
+          <w:b/>
+          <w:bCs/>
+          <w:color w:val="1A3A5C"/>
+          <w:sz w:val="28"/>
+          <w:szCs w:val="28"/>
+        </w:rPr>
       </w:pPr>
       <w:r>
         <w:rPr>
@@ -365,327 +367,21 @@
           <w:sz w:val="28"/>
           <w:szCs w:val="28"/>
         </w:rPr>
-        <w:t>1 INTRODUÇÃO</w:t>
-      </w:r>
-    </w:p>
-    <w:p>
-      <w:pPr>
-        <w:pStyle w:val="Normal"/>
-        <w:spacing w:before="80" w:after="80"/>
-        <w:ind w:firstLine="720"/>
-        <w:jc w:val="both"/>
-        <w:rPr/>
-      </w:pPr>
-      <w:r>
-        <w:rPr>
-          <w:rFonts w:eastAsia="Times New Roman" w:cs="Times New Roman"/>
-          <w:color w:val="333333"/>
-          <w:sz w:val="24"/>
-          <w:szCs w:val="24"/>
-        </w:rPr>
-        <w:t>A gestão eficiente de recursos humanos em unidades de saúde representa um dos maiores desafios operacionais do setor. A alocação manual e intuitiva de médicos por turno, sem suporte de dados ou modelos analíticos, gera dois problemas recorrentes: a sobrecarga de profissionais em horários de pico e a ociosidade em períodos de baixa demanda — ambos com impacto direto no custo operacional e na qualidade do atendimento ao paciente.</w:t>
-      </w:r>
-    </w:p>
-    <w:p>
-      <w:pPr>
-        <w:pStyle w:val="Normal"/>
-        <w:spacing w:before="80" w:after="80"/>
-        <w:ind w:firstLine="720"/>
-        <w:jc w:val="both"/>
-        <w:rPr/>
-      </w:pPr>
-      <w:r>
-        <w:rPr>
-          <w:rFonts w:eastAsia="Times New Roman" w:cs="Times New Roman"/>
-          <w:color w:val="333333"/>
-          <w:sz w:val="24"/>
-          <w:szCs w:val="24"/>
-        </w:rPr>
-        <w:t>A MedFácil Clínicas, empresa fictícia criada para este projeto, opera unidades de pronto atendimento em São Paulo e enfrenta exatamente esses problemas. Com um tempo médio de espera superior a 90 minutos em horários de pico e ausência total de dashboards gerenciais, a diretoria não dispõe de informações para tomar decisões baseadas em dados.</w:t>
-      </w:r>
-    </w:p>
-    <w:p>
-      <w:pPr>
-        <w:pStyle w:val="Normal"/>
-        <w:spacing w:before="80" w:after="80"/>
-        <w:ind w:firstLine="720"/>
-        <w:jc w:val="both"/>
-        <w:rPr/>
-      </w:pPr>
-      <w:r>
-        <w:rPr>
-          <w:rFonts w:eastAsia="Times New Roman" w:cs="Times New Roman"/>
-          <w:color w:val="333333"/>
-          <w:sz w:val="24"/>
-          <w:szCs w:val="24"/>
-        </w:rPr>
-        <w:t>Este trabalho propõe a construção de um sistema de análise de dados e otimização capaz de: (a) processar e analisar dados históricos de atendimentos; (b) calcular indicadores-chave de desempenho (KPIs); (c) determinar a alocação ótima de médicos por turno através de um modelo de Programação Linear Inteira; e (d) garantir a conformidade com a Lei Geral de Proteção de Dados Pessoais (LGPD — Lei nº 13.709/2018) em todo o pipeline de dados.</w:t>
-      </w:r>
-    </w:p>
-    <w:p>
-      <w:pPr>
-        <w:pStyle w:val="Heading2"/>
-        <w:spacing w:before="280" w:after="120"/>
-        <w:rPr/>
-      </w:pPr>
-      <w:r>
-        <w:rPr>
-          <w:rFonts w:eastAsia="Arial" w:cs="Arial" w:ascii="Arial" w:hAnsi="Arial"/>
+      </w:r>
+    </w:p>
+    <w:p>
+      <w:pPr>
+        <w:pStyle w:val="Normal"/>
+        <w:spacing w:before="0" w:after="240"/>
+        <w:jc w:val="center"/>
+        <w:rPr>
+          <w:rFonts w:ascii="Arial" w:hAnsi="Arial" w:eastAsia="Arial" w:cs="Arial"/>
           <w:b/>
           <w:bCs/>
-          <w:color w:val="2E6DA4"/>
-          <w:sz w:val="24"/>
-          <w:szCs w:val="24"/>
-        </w:rPr>
-        <w:t>1.1 Objetivos</w:t>
-      </w:r>
-    </w:p>
-    <w:p>
-      <w:pPr>
-        <w:pStyle w:val="Heading3"/>
-        <w:spacing w:before="200" w:after="80"/>
-        <w:rPr/>
-      </w:pPr>
-      <w:r>
-        <w:rPr>
-          <w:rFonts w:eastAsia="Arial" w:cs="Arial" w:ascii="Arial" w:hAnsi="Arial"/>
-          <w:b/>
-          <w:bCs/>
-          <w:color w:val="2E6DA4"/>
-          <w:sz w:val="22"/>
-          <w:szCs w:val="22"/>
-        </w:rPr>
-        <w:t>1.1.1 Objetivo Geral</w:t>
-      </w:r>
-    </w:p>
-    <w:p>
-      <w:pPr>
-        <w:pStyle w:val="Normal"/>
-        <w:spacing w:before="80" w:after="80"/>
-        <w:ind w:firstLine="720"/>
-        <w:jc w:val="both"/>
-        <w:rPr/>
-      </w:pPr>
-      <w:r>
-        <w:rPr>
-          <w:rFonts w:eastAsia="Times New Roman" w:cs="Times New Roman"/>
-          <w:color w:val="333333"/>
-          <w:sz w:val="24"/>
-          <w:szCs w:val="24"/>
-        </w:rPr>
-        <w:t>Desenvolver um sistema computacional integrado, utilizando Python e técnicas de Inteligência Artificial, para otimizar a alocação de médicos por turno na MedFácil Clínicas, reduzindo custos operacionais e melhorando a qualidade do atendimento. O sistema utiliza Inteligência Artificial baseada em otimização matemática — especificamente Programação Linear Inteira — para tomar decisões de alocação de recursos de forma autônoma e eficiente, minimizando custo sem intervenção humana.</w:t>
-      </w:r>
-    </w:p>
-    <w:p>
-      <w:pPr>
-        <w:pStyle w:val="Heading3"/>
-        <w:spacing w:before="200" w:after="80"/>
-        <w:rPr/>
-      </w:pPr>
-      <w:r>
-        <w:rPr>
-          <w:rFonts w:eastAsia="Arial" w:cs="Arial" w:ascii="Arial" w:hAnsi="Arial"/>
-          <w:b/>
-          <w:bCs/>
-          <w:color w:val="2E6DA4"/>
-          <w:sz w:val="22"/>
-          <w:szCs w:val="22"/>
-        </w:rPr>
-        <w:t>1.1.2 Objetivos Específicos</w:t>
-      </w:r>
-    </w:p>
-    <w:p>
-      <w:pPr>
-        <w:pStyle w:val="ListParagraph"/>
-        <w:numPr>
-          <w:ilvl w:val="0"/>
-          <w:numId w:val="3"/>
-        </w:numPr>
-        <w:spacing w:before="60" w:after="60"/>
-        <w:rPr/>
-      </w:pPr>
-      <w:r>
-        <w:rPr>
-          <w:rFonts w:eastAsia="Arial" w:cs="Arial" w:ascii="Arial" w:hAnsi="Arial"/>
-          <w:color w:val="333333"/>
-          <w:sz w:val="22"/>
-          <w:szCs w:val="22"/>
-        </w:rPr>
-        <w:t>Construir um pipeline ETL em Python para extração, limpeza, transformação e anonimização de dataset público de saúde com 55.500 registros.</w:t>
-      </w:r>
-    </w:p>
-    <w:p>
-      <w:pPr>
-        <w:pStyle w:val="ListParagraph"/>
-        <w:numPr>
-          <w:ilvl w:val="0"/>
-          <w:numId w:val="1"/>
-        </w:numPr>
-        <w:spacing w:before="60" w:after="60"/>
-        <w:rPr/>
-      </w:pPr>
-      <w:r>
-        <w:rPr>
-          <w:rFonts w:eastAsia="Arial" w:cs="Arial" w:ascii="Arial" w:hAnsi="Arial"/>
-          <w:color w:val="333333"/>
-          <w:sz w:val="22"/>
-          <w:szCs w:val="22"/>
-        </w:rPr>
-        <w:t>Realizar Análise Exploratória de Dados (EDA) com identificação de padrões de demanda por turno, especialidade e período temporal.</w:t>
-      </w:r>
-    </w:p>
-    <w:p>
-      <w:pPr>
-        <w:pStyle w:val="ListParagraph"/>
-        <w:numPr>
-          <w:ilvl w:val="0"/>
-          <w:numId w:val="1"/>
-        </w:numPr>
-        <w:spacing w:before="60" w:after="60"/>
-        <w:rPr/>
-      </w:pPr>
-      <w:r>
-        <w:rPr>
-          <w:rFonts w:eastAsia="Arial" w:cs="Arial" w:ascii="Arial" w:hAnsi="Arial"/>
-          <w:color w:val="333333"/>
-          <w:sz w:val="22"/>
-          <w:szCs w:val="22"/>
-        </w:rPr>
-        <w:t>Calcular três KPIs principais: Tempo Médio de Espera (TME), Taxa de Ocupação por Turno e Volume de Atendimentos por Condição Médica.</w:t>
-      </w:r>
-    </w:p>
-    <w:p>
-      <w:pPr>
-        <w:pStyle w:val="ListParagraph"/>
-        <w:numPr>
-          <w:ilvl w:val="0"/>
-          <w:numId w:val="1"/>
-        </w:numPr>
-        <w:spacing w:before="60" w:after="60"/>
-        <w:rPr/>
-      </w:pPr>
-      <w:r>
-        <w:rPr>
-          <w:rFonts w:eastAsia="Arial" w:cs="Arial" w:ascii="Arial" w:hAnsi="Arial"/>
-          <w:color w:val="333333"/>
-          <w:sz w:val="22"/>
-          <w:szCs w:val="22"/>
-        </w:rPr>
-        <w:t>Desenvolver e resolver um modelo de Programação Linear Inteira (PLI) com três cenários de análise (Baseline, Otimizado e Pico).</w:t>
-      </w:r>
-    </w:p>
-    <w:p>
-      <w:pPr>
-        <w:pStyle w:val="ListParagraph"/>
-        <w:numPr>
-          <w:ilvl w:val="0"/>
-          <w:numId w:val="1"/>
-        </w:numPr>
-        <w:spacing w:before="60" w:after="60"/>
-        <w:rPr/>
-      </w:pPr>
-      <w:r>
-        <w:rPr>
-          <w:rFonts w:eastAsia="Arial" w:cs="Arial" w:ascii="Arial" w:hAnsi="Arial"/>
-          <w:color w:val="333333"/>
-          <w:sz w:val="22"/>
-          <w:szCs w:val="22"/>
-        </w:rPr>
-        <w:t>Documentar a conformidade com a LGPD através de mapeamento de dados pessoais, Matriz GUT de riscos e Política de Autenticação.</w:t>
-      </w:r>
-    </w:p>
-    <w:p>
-      <w:pPr>
-        <w:pStyle w:val="Heading2"/>
-        <w:spacing w:before="280" w:after="120"/>
-        <w:rPr/>
-      </w:pPr>
-      <w:r>
-        <w:rPr>
-          <w:rFonts w:eastAsia="Arial" w:cs="Arial" w:ascii="Arial" w:hAnsi="Arial"/>
-          <w:b/>
-          <w:bCs/>
-          <w:color w:val="2E6DA4"/>
-          <w:sz w:val="24"/>
-          <w:szCs w:val="24"/>
-        </w:rPr>
-        <w:t>1.2 Justificativa</w:t>
-      </w:r>
-    </w:p>
-    <w:p>
-      <w:pPr>
-        <w:pStyle w:val="Normal"/>
-        <w:spacing w:before="80" w:after="80"/>
-        <w:ind w:firstLine="720"/>
-        <w:jc w:val="both"/>
-        <w:rPr/>
-      </w:pPr>
-      <w:r>
-        <w:rPr>
-          <w:rFonts w:eastAsia="Times New Roman" w:cs="Times New Roman"/>
-          <w:color w:val="333333"/>
-          <w:sz w:val="24"/>
-          <w:szCs w:val="24"/>
-        </w:rPr>
-        <w:t>A aplicação de técnicas de Inteligência Artificial — especificamente otimização matemática via Programação Linear Inteira — na gestão de saúde é uma tendência consolidada globalmente. No Brasil, a escassez de médicos em determinadas especialidades e regiões torna a otimização da alocação de profissionais ainda mais crítica. Este projeto demonstra, em escala acadêmica, como ferramentas computacionais acessíveis — Python, PuLP, Pandas, Matplotlib — podem gerar economia significativa e embasar decisões gerenciais com dados concretos.</w:t>
-      </w:r>
-    </w:p>
-    <w:p>
-      <w:pPr>
-        <w:pStyle w:val="Heading2"/>
-        <w:spacing w:before="280" w:after="120"/>
-        <w:rPr/>
-      </w:pPr>
-      <w:r>
-        <w:rPr>
-          <w:rFonts w:eastAsia="Arial" w:cs="Arial" w:ascii="Arial" w:hAnsi="Arial"/>
-          <w:b/>
-          <w:bCs/>
-          <w:color w:val="2E6DA4"/>
-          <w:sz w:val="24"/>
-          <w:szCs w:val="24"/>
-        </w:rPr>
-        <w:t>1.3 Organização do Documento</w:t>
-      </w:r>
-    </w:p>
-    <w:p>
-      <w:pPr>
-        <w:pStyle w:val="Normal"/>
-        <w:spacing w:before="80" w:after="80"/>
-        <w:ind w:firstLine="720"/>
-        <w:jc w:val="both"/>
-        <w:rPr/>
-      </w:pPr>
-      <w:r>
-        <w:rPr>
-          <w:rFonts w:eastAsia="Times New Roman" w:cs="Times New Roman"/>
-          <w:color w:val="333333"/>
-          <w:sz w:val="24"/>
-          <w:szCs w:val="24"/>
-        </w:rPr>
-        <w:t>O presente documento está organizado em sete seções: a Seção 2 apresenta a revisão bibliográfica; a Seção 3 descreve a metodologia e as ferramentas utilizadas; a Seção 4 detalha o pipeline de dados e os métodos numéricos aplicados; a Seção 5 apresenta o modelo de IA e simulação; a Seção 6 trata da segurança e LGPD; a Seção 7 descreve a automação e gestão do projeto; e a Seção 8 consolida os resultados e conclusões.</w:t>
-      </w:r>
-    </w:p>
-    <w:p>
-      <w:pPr>
-        <w:pStyle w:val="Normal"/>
-        <w:rPr/>
-      </w:pPr>
-      <w:r>
-        <w:rPr/>
-      </w:r>
-      <w:r>
-        <w:br w:type="page"/>
-      </w:r>
-    </w:p>
-    <w:p>
-      <w:pPr>
-        <w:pStyle w:val="Heading1"/>
-        <w:pBdr>
-          <w:bottom w:val="single" w:sz="10" w:space="4" w:color="2E6DA4"/>
-        </w:pBdr>
-        <w:spacing w:before="0" w:after="200"/>
-        <w:rPr/>
+          <w:color w:val="1A3A5C"/>
+          <w:sz w:val="28"/>
+          <w:szCs w:val="28"/>
+        </w:rPr>
       </w:pPr>
       <w:r>
         <w:rPr>
@@ -696,7 +392,145 @@
           <w:sz w:val="28"/>
           <w:szCs w:val="28"/>
         </w:rPr>
-        <w:t>2 REVISÃO BIBLIOGRÁFICA</w:t>
+        <w:t>Estrutura do Repositório</w:t>
+      </w:r>
+    </w:p>
+    <w:p>
+      <w:pPr>
+        <w:pStyle w:val="Normal"/>
+        <w:spacing w:before="80" w:after="80"/>
+        <w:ind w:firstLine="720"/>
+        <w:jc w:val="both"/>
+        <w:rPr/>
+      </w:pPr>
+      <w:r>
+        <w:rPr>
+          <w:rFonts w:eastAsia="Times New Roman" w:cs="Times New Roman"/>
+          <w:color w:val="333333"/>
+          <w:sz w:val="24"/>
+          <w:szCs w:val="24"/>
+        </w:rPr>
+        <w:t xml:space="preserve">Todo o material do projeto está centralizado em pasta compartilhada no GitHub, compartilhada com o professor com permissão de leitura. Link do repositório: </w:t>
+      </w:r>
+      <w:hyperlink r:id="rId2">
+        <w:r>
+          <w:rPr>
+            <w:rStyle w:val="Hyperlink"/>
+          </w:rPr>
+          <w:t>https://github.com/robert-sampaio/medfacil</w:t>
+        </w:r>
+      </w:hyperlink>
+      <w:r>
+        <w:rPr/>
+        <w:t xml:space="preserve"> .</w:t>
+      </w:r>
+    </w:p>
+    <w:p>
+      <w:pPr>
+        <w:pStyle w:val="Normal"/>
+        <w:spacing w:before="80" w:after="80"/>
+        <w:ind w:firstLine="720"/>
+        <w:jc w:val="both"/>
+        <w:rPr/>
+      </w:pPr>
+      <w:r>
+        <w:rPr/>
+        <w:t xml:space="preserve">Assim como o link do vídeo da apresentação está aqui: </w:t>
+      </w:r>
+      <w:hyperlink r:id="rId3">
+        <w:r>
+          <w:rPr>
+            <w:rStyle w:val="Hyperlink"/>
+          </w:rPr>
+          <w:t>https://youtu.be/3S6xaa3CFJk</w:t>
+        </w:r>
+      </w:hyperlink>
+    </w:p>
+    <w:p>
+      <w:pPr>
+        <w:pStyle w:val="Normal"/>
+        <w:rPr/>
+      </w:pPr>
+      <w:r>
+        <w:rPr/>
+      </w:r>
+      <w:r>
+        <w:br w:type="page"/>
+      </w:r>
+    </w:p>
+    <w:p>
+      <w:pPr>
+        <w:pStyle w:val="Heading1"/>
+        <w:pBdr>
+          <w:bottom w:val="single" w:sz="10" w:space="4" w:color="2E6DA4"/>
+        </w:pBdr>
+        <w:spacing w:before="0" w:after="200"/>
+        <w:rPr/>
+      </w:pPr>
+      <w:r>
+        <w:rPr>
+          <w:rFonts w:eastAsia="Arial" w:cs="Arial"/>
+          <w:b/>
+          <w:bCs/>
+          <w:color w:val="1A3A5C"/>
+          <w:sz w:val="28"/>
+          <w:szCs w:val="28"/>
+        </w:rPr>
+        <w:t>1 INTRODUÇÃO</w:t>
+      </w:r>
+    </w:p>
+    <w:p>
+      <w:pPr>
+        <w:pStyle w:val="Normal"/>
+        <w:spacing w:before="80" w:after="80"/>
+        <w:ind w:firstLine="720"/>
+        <w:jc w:val="both"/>
+        <w:rPr/>
+      </w:pPr>
+      <w:r>
+        <w:rPr>
+          <w:rFonts w:eastAsia="Times New Roman" w:cs="Times New Roman"/>
+          <w:color w:val="333333"/>
+          <w:sz w:val="24"/>
+          <w:szCs w:val="24"/>
+        </w:rPr>
+        <w:t>A gestão eficiente de recursos humanos em unidades de saúde representa um dos maiores desafios operacionais do setor. A alocação manual e intuitiva de médicos por turno, sem suporte de dados ou modelos analíticos, gera dois problemas recorrentes: a sobrecarga de profissionais em horários de pico e a ociosidade em períodos de baixa demanda — ambos com impacto direto no custo operacional e na qualidade do atendimento ao paciente.</w:t>
+      </w:r>
+    </w:p>
+    <w:p>
+      <w:pPr>
+        <w:pStyle w:val="Normal"/>
+        <w:spacing w:before="80" w:after="80"/>
+        <w:ind w:firstLine="720"/>
+        <w:jc w:val="both"/>
+        <w:rPr/>
+      </w:pPr>
+      <w:r>
+        <w:rPr>
+          <w:rFonts w:eastAsia="Times New Roman" w:cs="Times New Roman"/>
+          <w:color w:val="333333"/>
+          <w:sz w:val="24"/>
+          <w:szCs w:val="24"/>
+        </w:rPr>
+        <w:t>A MedFácil Clínicas, empresa fictícia criada para este projeto, opera unidades de pronto atendimento em São Paulo e enfrenta exatamente esses problemas. Com um tempo médio de espera superior a 90 minutos em horários de pico e ausência total de dashboards gerenciais, a diretoria não dispõe de informações para tomar decisões baseadas em dados.</w:t>
+      </w:r>
+    </w:p>
+    <w:p>
+      <w:pPr>
+        <w:pStyle w:val="Normal"/>
+        <w:spacing w:before="80" w:after="80"/>
+        <w:ind w:firstLine="720"/>
+        <w:jc w:val="both"/>
+        <w:rPr/>
+      </w:pPr>
+      <w:r>
+        <w:rPr>
+          <w:rFonts w:eastAsia="Times New Roman" w:cs="Times New Roman"/>
+          <w:color w:val="333333"/>
+          <w:sz w:val="24"/>
+          <w:szCs w:val="24"/>
+        </w:rPr>
+        <w:t>Este trabalho propõe a construção de um sistema de análise de dados e otimização capaz de: (a) processar e analisar dados históricos de atendimentos; (b) calcular indicadores-chave de desempenho (KPIs); (c) determinar a alocação ótima de médicos por turno através de um modelo de Programação Linear Inteira; e (d) garantir a conformidade com a Lei Geral de Proteção de Dados Pessoais (LGPD — Lei nº 13.709/2018) em todo o pipeline de dados.</w:t>
       </w:r>
     </w:p>
     <w:p>
@@ -707,14 +541,32 @@
       </w:pPr>
       <w:r>
         <w:rPr>
-          <w:rFonts w:eastAsia="Arial" w:cs="Arial" w:ascii="Arial" w:hAnsi="Arial"/>
+          <w:rFonts w:eastAsia="Arial" w:cs="Arial"/>
           <w:b/>
           <w:bCs/>
           <w:color w:val="2E6DA4"/>
           <w:sz w:val="24"/>
           <w:szCs w:val="24"/>
         </w:rPr>
-        <w:t>2.1 Inteligência Artificial aplicada à Saúde</w:t>
+        <w:t>1.1 Objetivos</w:t>
+      </w:r>
+    </w:p>
+    <w:p>
+      <w:pPr>
+        <w:pStyle w:val="Heading3"/>
+        <w:spacing w:before="200" w:after="80"/>
+        <w:rPr/>
+      </w:pPr>
+      <w:r>
+        <w:rPr>
+          <w:rFonts w:eastAsia="Arial" w:cs="Arial"/>
+          <w:b/>
+          <w:bCs/>
+          <w:color w:val="2E6DA4"/>
+          <w:sz w:val="22"/>
+          <w:szCs w:val="22"/>
+        </w:rPr>
+        <w:t>1.1.1 Objetivo Geral</w:t>
       </w:r>
     </w:p>
     <w:p>
@@ -732,25 +584,125 @@
           <w:sz w:val="24"/>
           <w:szCs w:val="24"/>
         </w:rPr>
-        <w:t>A aplicação de Inteligência Artificial (IA) no setor de saúde tem se expandido rapidamente nas últimas décadas. Segundo Topol (2019), sistemas de IA são capazes de superar especialistas humanos em tarefas diagnósticas específicas, como a identificação de melanomas e pneumonias em imagens médicas. No contexto de gestão hospitalar, a IA tem sido aplicada para previsão de demanda, alocação de leitos, triagem de pacientes e otimização de escalas médicas.</w:t>
-      </w:r>
-    </w:p>
-    <w:p>
-      <w:pPr>
-        <w:pStyle w:val="Normal"/>
-        <w:spacing w:before="80" w:after="80"/>
-        <w:ind w:firstLine="720"/>
-        <w:jc w:val="both"/>
-        <w:rPr/>
-      </w:pPr>
-      <w:r>
-        <w:rPr>
-          <w:rFonts w:eastAsia="Times New Roman" w:cs="Times New Roman"/>
+        <w:t>Desenvolver um sistema computacional integrado, utilizando Python e técnicas de Inteligência Artificial, para otimizar a alocação de médicos por turno na MedFácil Clínicas, reduzindo custos operacionais e melhorando a qualidade do atendimento. O sistema utiliza Inteligência Artificial baseada em otimização matemática — especificamente Programação Linear Inteira — para tomar decisões de alocação de recursos de forma autônoma e eficiente, minimizando custo sem intervenção humana.</w:t>
+      </w:r>
+    </w:p>
+    <w:p>
+      <w:pPr>
+        <w:pStyle w:val="Heading3"/>
+        <w:spacing w:before="200" w:after="80"/>
+        <w:rPr/>
+      </w:pPr>
+      <w:r>
+        <w:rPr>
+          <w:rFonts w:eastAsia="Arial" w:cs="Arial"/>
+          <w:b/>
+          <w:bCs/>
+          <w:color w:val="2E6DA4"/>
+          <w:sz w:val="22"/>
+          <w:szCs w:val="22"/>
+        </w:rPr>
+        <w:t>1.1.2 Objetivos Específicos</w:t>
+      </w:r>
+    </w:p>
+    <w:p>
+      <w:pPr>
+        <w:pStyle w:val="ListParagraph"/>
+        <w:numPr>
+          <w:ilvl w:val="0"/>
+          <w:numId w:val="4"/>
+        </w:numPr>
+        <w:spacing w:before="60" w:after="60"/>
+        <w:rPr/>
+      </w:pPr>
+      <w:r>
+        <w:rPr>
+          <w:rFonts w:eastAsia="Arial" w:cs="Arial" w:ascii="Arial" w:hAnsi="Arial"/>
           <w:color w:val="333333"/>
-          <w:sz w:val="24"/>
-          <w:szCs w:val="24"/>
-        </w:rPr>
-        <w:t>No Brasil, a adoção de tecnologias de análise de dados em saúde ainda é incipiente, especialmente em unidades de médio porte. A maioria dos processos de alocação de pessoal ainda é realizada de forma manual, sem suporte de modelos analíticos (CFM, 2023). Este cenário evidencia a oportunidade e a necessidade de projetos como o desenvolvido neste trabalho.</w:t>
+          <w:sz w:val="22"/>
+          <w:szCs w:val="22"/>
+        </w:rPr>
+        <w:t>Construir um pipeline ETL em Python para extração, limpeza, transformação e anonimização de dataset público de saúde com 55.500 registros.</w:t>
+      </w:r>
+    </w:p>
+    <w:p>
+      <w:pPr>
+        <w:pStyle w:val="ListParagraph"/>
+        <w:numPr>
+          <w:ilvl w:val="0"/>
+          <w:numId w:val="2"/>
+        </w:numPr>
+        <w:spacing w:before="60" w:after="60"/>
+        <w:rPr/>
+      </w:pPr>
+      <w:r>
+        <w:rPr>
+          <w:rFonts w:eastAsia="Arial" w:cs="Arial" w:ascii="Arial" w:hAnsi="Arial"/>
+          <w:color w:val="333333"/>
+          <w:sz w:val="22"/>
+          <w:szCs w:val="22"/>
+        </w:rPr>
+        <w:t>Realizar Análise Exploratória de Dados (EDA) com identificação de padrões de demanda por turno, especialidade e período temporal.</w:t>
+      </w:r>
+    </w:p>
+    <w:p>
+      <w:pPr>
+        <w:pStyle w:val="ListParagraph"/>
+        <w:numPr>
+          <w:ilvl w:val="0"/>
+          <w:numId w:val="2"/>
+        </w:numPr>
+        <w:spacing w:before="60" w:after="60"/>
+        <w:rPr/>
+      </w:pPr>
+      <w:r>
+        <w:rPr>
+          <w:rFonts w:eastAsia="Arial" w:cs="Arial" w:ascii="Arial" w:hAnsi="Arial"/>
+          <w:color w:val="333333"/>
+          <w:sz w:val="22"/>
+          <w:szCs w:val="22"/>
+        </w:rPr>
+        <w:t>Calcular três KPIs principais: Tempo Médio de Espera (TME), Taxa de Ocupação por Turno e Volume de Atendimentos por Condição Médica.</w:t>
+      </w:r>
+    </w:p>
+    <w:p>
+      <w:pPr>
+        <w:pStyle w:val="ListParagraph"/>
+        <w:numPr>
+          <w:ilvl w:val="0"/>
+          <w:numId w:val="2"/>
+        </w:numPr>
+        <w:spacing w:before="60" w:after="60"/>
+        <w:rPr/>
+      </w:pPr>
+      <w:r>
+        <w:rPr>
+          <w:rFonts w:eastAsia="Arial" w:cs="Arial" w:ascii="Arial" w:hAnsi="Arial"/>
+          <w:color w:val="333333"/>
+          <w:sz w:val="22"/>
+          <w:szCs w:val="22"/>
+        </w:rPr>
+        <w:t>Desenvolver e resolver um modelo de Programação Linear Inteira (PLI) com três cenários de análise (Baseline, Otimizado e Pico).</w:t>
+      </w:r>
+    </w:p>
+    <w:p>
+      <w:pPr>
+        <w:pStyle w:val="ListParagraph"/>
+        <w:numPr>
+          <w:ilvl w:val="0"/>
+          <w:numId w:val="2"/>
+        </w:numPr>
+        <w:spacing w:before="60" w:after="60"/>
+        <w:rPr/>
+      </w:pPr>
+      <w:r>
+        <w:rPr>
+          <w:rFonts w:eastAsia="Arial" w:cs="Arial" w:ascii="Arial" w:hAnsi="Arial"/>
+          <w:color w:val="333333"/>
+          <w:sz w:val="22"/>
+          <w:szCs w:val="22"/>
+        </w:rPr>
+        <w:t>Documentar a conformidade com a LGPD através de mapeamento de dados pessoais, Matriz GUT de riscos e Política de Autenticação.</w:t>
       </w:r>
     </w:p>
     <w:p>
@@ -761,14 +713,14 @@
       </w:pPr>
       <w:r>
         <w:rPr>
-          <w:rFonts w:eastAsia="Arial" w:cs="Arial" w:ascii="Arial" w:hAnsi="Arial"/>
+          <w:rFonts w:eastAsia="Arial" w:cs="Arial"/>
           <w:b/>
           <w:bCs/>
           <w:color w:val="2E6DA4"/>
           <w:sz w:val="24"/>
           <w:szCs w:val="24"/>
         </w:rPr>
-        <w:t>2.2 Programação Linear Inteira em Problemas de Alocação</w:t>
+        <w:t>1.2 Justificativa</w:t>
       </w:r>
     </w:p>
     <w:p>
@@ -786,25 +738,7 @@
           <w:sz w:val="24"/>
           <w:szCs w:val="24"/>
         </w:rPr>
-        <w:t>A Programação Linear Inteira (PLI) é um ramo da Pesquisa Operacional que trata de problemas de otimização onde as variáveis de decisão são restritas a valores inteiros. A alocação de pessoal em turnos (Staff Scheduling) é um dos problemas clássicos da PLI, amplamente estudado na literatura desde os trabalhos de Dantzig (1954) sobre programação linear.</w:t>
-      </w:r>
-    </w:p>
-    <w:p>
-      <w:pPr>
-        <w:pStyle w:val="Normal"/>
-        <w:spacing w:before="80" w:after="80"/>
-        <w:ind w:firstLine="720"/>
-        <w:jc w:val="both"/>
-        <w:rPr/>
-      </w:pPr>
-      <w:r>
-        <w:rPr>
-          <w:rFonts w:eastAsia="Times New Roman" w:cs="Times New Roman"/>
-          <w:color w:val="333333"/>
-          <w:sz w:val="24"/>
-          <w:szCs w:val="24"/>
-        </w:rPr>
-        <w:t>O modelo de alocação de turnos pode ser formulado como: minimizar o custo total de pessoal sujeito a restrições de cobertura mínima de demanda, limites de contratação e integralidade das variáveis de decisão. Diversas bibliotecas open-source implementam solvers para PLI, sendo o PuLP (com o solver CBC) uma das mais utilizadas no ecossistema Python (Mitchell et al., 2011).</w:t>
+        <w:t>A aplicação de técnicas de Inteligência Artificial — especificamente otimização matemática via Programação Linear Inteira — na gestão de saúde é uma tendência consolidada globalmente. No Brasil, a escassez de médicos em determinadas especialidades e regiões torna a otimização da alocação de profissionais ainda mais crítica. Este projeto demonstra, em escala acadêmica, como ferramentas computacionais acessíveis — Python, PuLP, Pandas, Matplotlib — podem gerar economia significativa e embasar decisões gerenciais com dados concretos.</w:t>
       </w:r>
     </w:p>
     <w:p>
@@ -815,14 +749,14 @@
       </w:pPr>
       <w:r>
         <w:rPr>
-          <w:rFonts w:eastAsia="Arial" w:cs="Arial" w:ascii="Arial" w:hAnsi="Arial"/>
+          <w:rFonts w:eastAsia="Arial" w:cs="Arial"/>
           <w:b/>
           <w:bCs/>
           <w:color w:val="2E6DA4"/>
           <w:sz w:val="24"/>
           <w:szCs w:val="24"/>
         </w:rPr>
-        <w:t>2.3 ETL e Análise de Dados em Python</w:t>
+        <w:t>1.3 Organização do Documento</w:t>
       </w:r>
     </w:p>
     <w:p>
@@ -840,25 +774,40 @@
           <w:sz w:val="24"/>
           <w:szCs w:val="24"/>
         </w:rPr>
-        <w:t>O processo de ETL (Extract, Transform, Load) é fundamental em projetos de análise de dados. A biblioteca Pandas, criada por McKinney (2010), tornou-se o padrão de facto para manipulação de dados tabulares em Python, oferecendo estruturas de dados eficientes e uma API expressiva para transformações complexas.</w:t>
-      </w:r>
-    </w:p>
-    <w:p>
-      <w:pPr>
-        <w:pStyle w:val="Normal"/>
-        <w:spacing w:before="80" w:after="80"/>
-        <w:ind w:firstLine="720"/>
-        <w:jc w:val="both"/>
-        <w:rPr/>
-      </w:pPr>
-      <w:r>
-        <w:rPr>
-          <w:rFonts w:eastAsia="Times New Roman" w:cs="Times New Roman"/>
-          <w:color w:val="333333"/>
-          <w:sz w:val="24"/>
-          <w:szCs w:val="24"/>
-        </w:rPr>
-        <w:t>A Análise Exploratória de Dados (EDA), conceito introduzido por Tukey (1977), consiste na investigação sistemática de um conjunto de dados através de estatísticas descritivas e visualizações, com o objetivo de identificar padrões, anomalias e hipóteses antes da modelagem formal. Ferramentas como Matplotlib e Seaborn facilitam a geração de visualizações de alta qualidade em Python.</w:t>
+        <w:t>O presente documento está organizado em sete seções: a Seção 2 apresenta a revisão bibliográfica; a Seção 3 descreve a metodologia e as ferramentas utilizadas; a Seção 4 detalha o pipeline de dados e os métodos numéricos aplicados; a Seção 5 apresenta o modelo de IA e simulação; a Seção 6 trata da segurança e LGPD; a Seção 7 descreve a automação e gestão do projeto; e a Seção 8 consolida os resultados e conclusões.</w:t>
+      </w:r>
+    </w:p>
+    <w:p>
+      <w:pPr>
+        <w:pStyle w:val="Normal"/>
+        <w:rPr/>
+      </w:pPr>
+      <w:r>
+        <w:rPr/>
+      </w:r>
+      <w:r>
+        <w:br w:type="page"/>
+      </w:r>
+    </w:p>
+    <w:p>
+      <w:pPr>
+        <w:pStyle w:val="Heading1"/>
+        <w:pBdr>
+          <w:bottom w:val="single" w:sz="10" w:space="4" w:color="2E6DA4"/>
+        </w:pBdr>
+        <w:spacing w:before="0" w:after="200"/>
+        <w:rPr/>
+      </w:pPr>
+      <w:r>
+        <w:rPr>
+          <w:rFonts w:eastAsia="Arial" w:cs="Arial"/>
+          <w:b/>
+          <w:bCs/>
+          <w:color w:val="1A3A5C"/>
+          <w:sz w:val="28"/>
+          <w:szCs w:val="28"/>
+        </w:rPr>
+        <w:t>2 REVISÃO BIBLIOGRÁFICA</w:t>
       </w:r>
     </w:p>
     <w:p>
@@ -869,13 +818,175 @@
       </w:pPr>
       <w:r>
         <w:rPr>
-          <w:rFonts w:eastAsia="Arial" w:cs="Arial" w:ascii="Arial" w:hAnsi="Arial"/>
+          <w:rFonts w:eastAsia="Arial" w:cs="Arial"/>
           <w:b/>
           <w:bCs/>
           <w:color w:val="2E6DA4"/>
           <w:sz w:val="24"/>
           <w:szCs w:val="24"/>
         </w:rPr>
+        <w:t>2.1 Inteligência Artificial aplicada à Saúde</w:t>
+      </w:r>
+    </w:p>
+    <w:p>
+      <w:pPr>
+        <w:pStyle w:val="Normal"/>
+        <w:spacing w:before="80" w:after="80"/>
+        <w:ind w:firstLine="720"/>
+        <w:jc w:val="both"/>
+        <w:rPr/>
+      </w:pPr>
+      <w:r>
+        <w:rPr>
+          <w:rFonts w:eastAsia="Times New Roman" w:cs="Times New Roman"/>
+          <w:color w:val="333333"/>
+          <w:sz w:val="24"/>
+          <w:szCs w:val="24"/>
+        </w:rPr>
+        <w:t>A aplicação de Inteligência Artificial (IA) no setor de saúde tem se expandido rapidamente nas últimas décadas. Segundo Topol (2019), sistemas de IA são capazes de superar especialistas humanos em tarefas diagnósticas específicas, como a identificação de melanomas e pneumonias em imagens médicas. No contexto de gestão hospitalar, a IA tem sido aplicada para previsão de demanda, alocação de leitos, triagem de pacientes e otimização de escalas médicas.</w:t>
+      </w:r>
+    </w:p>
+    <w:p>
+      <w:pPr>
+        <w:pStyle w:val="Normal"/>
+        <w:spacing w:before="80" w:after="80"/>
+        <w:ind w:firstLine="720"/>
+        <w:jc w:val="both"/>
+        <w:rPr/>
+      </w:pPr>
+      <w:r>
+        <w:rPr>
+          <w:rFonts w:eastAsia="Times New Roman" w:cs="Times New Roman"/>
+          <w:color w:val="333333"/>
+          <w:sz w:val="24"/>
+          <w:szCs w:val="24"/>
+        </w:rPr>
+        <w:t>No Brasil, a adoção de tecnologias de análise de dados em saúde ainda é incipiente, especialmente em unidades de médio porte. A maioria dos processos de alocação de pessoal ainda é realizada de forma manual, sem suporte de modelos analíticos (CFM, 2023). Este cenário evidencia a oportunidade e a necessidade de projetos como o desenvolvido neste trabalho.</w:t>
+      </w:r>
+    </w:p>
+    <w:p>
+      <w:pPr>
+        <w:pStyle w:val="Heading2"/>
+        <w:spacing w:before="280" w:after="120"/>
+        <w:rPr/>
+      </w:pPr>
+      <w:r>
+        <w:rPr>
+          <w:rFonts w:eastAsia="Arial" w:cs="Arial"/>
+          <w:b/>
+          <w:bCs/>
+          <w:color w:val="2E6DA4"/>
+          <w:sz w:val="24"/>
+          <w:szCs w:val="24"/>
+        </w:rPr>
+        <w:t>2.2 Programação Linear Inteira em Problemas de Alocação</w:t>
+      </w:r>
+    </w:p>
+    <w:p>
+      <w:pPr>
+        <w:pStyle w:val="Normal"/>
+        <w:spacing w:before="80" w:after="80"/>
+        <w:ind w:firstLine="720"/>
+        <w:jc w:val="both"/>
+        <w:rPr/>
+      </w:pPr>
+      <w:r>
+        <w:rPr>
+          <w:rFonts w:eastAsia="Times New Roman" w:cs="Times New Roman"/>
+          <w:color w:val="333333"/>
+          <w:sz w:val="24"/>
+          <w:szCs w:val="24"/>
+        </w:rPr>
+        <w:t>A Programação Linear Inteira (PLI) é um ramo da Pesquisa Operacional que trata de problemas de otimização onde as variáveis de decisão são restritas a valores inteiros. A alocação de pessoal em turnos (Staff Scheduling) é um dos problemas clássicos da PLI, amplamente estudado na literatura desde os trabalhos de Dantzig (1954) sobre programação linear.</w:t>
+      </w:r>
+    </w:p>
+    <w:p>
+      <w:pPr>
+        <w:pStyle w:val="Normal"/>
+        <w:spacing w:before="80" w:after="80"/>
+        <w:ind w:firstLine="720"/>
+        <w:jc w:val="both"/>
+        <w:rPr/>
+      </w:pPr>
+      <w:r>
+        <w:rPr>
+          <w:rFonts w:eastAsia="Times New Roman" w:cs="Times New Roman"/>
+          <w:color w:val="333333"/>
+          <w:sz w:val="24"/>
+          <w:szCs w:val="24"/>
+        </w:rPr>
+        <w:t>O modelo de alocação de turnos pode ser formulado como: minimizar o custo total de pessoal sujeito a restrições de cobertura mínima de demanda, limites de contratação e integralidade das variáveis de decisão. Diversas bibliotecas open-source implementam solvers para PLI, sendo o PuLP (com o solver CBC) uma das mais utilizadas no ecossistema Python (Mitchell et al., 2011).</w:t>
+      </w:r>
+    </w:p>
+    <w:p>
+      <w:pPr>
+        <w:pStyle w:val="Heading2"/>
+        <w:spacing w:before="280" w:after="120"/>
+        <w:rPr/>
+      </w:pPr>
+      <w:r>
+        <w:rPr>
+          <w:rFonts w:eastAsia="Arial" w:cs="Arial"/>
+          <w:b/>
+          <w:bCs/>
+          <w:color w:val="2E6DA4"/>
+          <w:sz w:val="24"/>
+          <w:szCs w:val="24"/>
+        </w:rPr>
+        <w:t>2.3 ETL e Análise de Dados em Python</w:t>
+      </w:r>
+    </w:p>
+    <w:p>
+      <w:pPr>
+        <w:pStyle w:val="Normal"/>
+        <w:spacing w:before="80" w:after="80"/>
+        <w:ind w:firstLine="720"/>
+        <w:jc w:val="both"/>
+        <w:rPr/>
+      </w:pPr>
+      <w:r>
+        <w:rPr>
+          <w:rFonts w:eastAsia="Times New Roman" w:cs="Times New Roman"/>
+          <w:color w:val="333333"/>
+          <w:sz w:val="24"/>
+          <w:szCs w:val="24"/>
+        </w:rPr>
+        <w:t>O processo de ETL (Extract, Transform, Load) é fundamental em projetos de análise de dados. A biblioteca Pandas, criada por McKinney (2010), tornou-se o padrão de facto para manipulação de dados tabulares em Python, oferecendo estruturas de dados eficientes e uma API expressiva para transformações complexas.</w:t>
+      </w:r>
+    </w:p>
+    <w:p>
+      <w:pPr>
+        <w:pStyle w:val="Normal"/>
+        <w:spacing w:before="80" w:after="80"/>
+        <w:ind w:firstLine="720"/>
+        <w:jc w:val="both"/>
+        <w:rPr/>
+      </w:pPr>
+      <w:r>
+        <w:rPr>
+          <w:rFonts w:eastAsia="Times New Roman" w:cs="Times New Roman"/>
+          <w:color w:val="333333"/>
+          <w:sz w:val="24"/>
+          <w:szCs w:val="24"/>
+        </w:rPr>
+        <w:t>A Análise Exploratória de Dados (EDA), conceito introduzido por Tukey (1977), consiste na investigação sistemática de um conjunto de dados através de estatísticas descritivas e visualizações, com o objetivo de identificar padrões, anomalias e hipóteses antes da modelagem formal. Ferramentas como Matplotlib e Seaborn facilitam a geração de visualizações de alta qualidade em Python.</w:t>
+      </w:r>
+    </w:p>
+    <w:p>
+      <w:pPr>
+        <w:pStyle w:val="Heading2"/>
+        <w:spacing w:before="280" w:after="120"/>
+        <w:rPr/>
+      </w:pPr>
+      <w:r>
+        <w:rPr>
+          <w:rFonts w:eastAsia="Arial" w:cs="Arial"/>
+          <w:b/>
+          <w:bCs/>
+          <w:color w:val="2E6DA4"/>
+          <w:sz w:val="24"/>
+          <w:szCs w:val="24"/>
+        </w:rPr>
         <w:t>2.4 LGPD e Proteção de Dados em Saúde</w:t>
       </w:r>
     </w:p>
@@ -938,7 +1049,7 @@
       </w:pPr>
       <w:r>
         <w:rPr>
-          <w:rFonts w:eastAsia="Arial" w:cs="Arial" w:ascii="Arial" w:hAnsi="Arial"/>
+          <w:rFonts w:eastAsia="Arial" w:cs="Arial"/>
           <w:b/>
           <w:bCs/>
           <w:color w:val="1A3A5C"/>
@@ -956,7 +1067,7 @@
       </w:pPr>
       <w:r>
         <w:rPr>
-          <w:rFonts w:eastAsia="Arial" w:cs="Arial" w:ascii="Arial" w:hAnsi="Arial"/>
+          <w:rFonts w:eastAsia="Arial" w:cs="Arial"/>
           <w:b/>
           <w:bCs/>
           <w:color w:val="2E6DA4"/>
@@ -992,7 +1103,7 @@
       </w:pPr>
       <w:r>
         <w:rPr>
-          <w:rFonts w:eastAsia="Arial" w:cs="Arial" w:ascii="Arial" w:hAnsi="Arial"/>
+          <w:rFonts w:eastAsia="Arial" w:cs="Arial"/>
           <w:b/>
           <w:bCs/>
           <w:color w:val="2E6DA4"/>
@@ -2620,7 +2731,7 @@
       </w:pPr>
       <w:r>
         <w:rPr>
-          <w:rFonts w:eastAsia="Arial" w:cs="Arial" w:ascii="Arial" w:hAnsi="Arial"/>
+          <w:rFonts w:eastAsia="Arial" w:cs="Arial"/>
           <w:b/>
           <w:bCs/>
           <w:color w:val="2E6DA4"/>
@@ -2654,15 +2765,15 @@
         </w:tblCellMar>
       </w:tblPr>
       <w:tblGrid>
-        <w:gridCol w:w="2199"/>
+        <w:gridCol w:w="2198"/>
         <w:gridCol w:w="1400"/>
-        <w:gridCol w:w="5427"/>
+        <w:gridCol w:w="5428"/>
       </w:tblGrid>
       <w:tr>
         <w:trPr/>
         <w:tc>
           <w:tcPr>
-            <w:tcW w:w="2199" w:type="dxa"/>
+            <w:tcW w:w="2198" w:type="dxa"/>
             <w:tcBorders>
               <w:top w:val="single" w:sz="2" w:space="0" w:color="CCCCCC"/>
               <w:start w:val="single" w:sz="2" w:space="0" w:color="CCCCCC"/>
@@ -2724,7 +2835,7 @@
         </w:tc>
         <w:tc>
           <w:tcPr>
-            <w:tcW w:w="5427" w:type="dxa"/>
+            <w:tcW w:w="5428" w:type="dxa"/>
             <w:tcBorders>
               <w:top w:val="single" w:sz="2" w:space="0" w:color="CCCCCC"/>
               <w:start w:val="single" w:sz="2" w:space="0" w:color="CCCCCC"/>
@@ -2758,7 +2869,7 @@
         <w:trPr/>
         <w:tc>
           <w:tcPr>
-            <w:tcW w:w="2199" w:type="dxa"/>
+            <w:tcW w:w="2198" w:type="dxa"/>
             <w:tcBorders>
               <w:top w:val="single" w:sz="2" w:space="0" w:color="CCCCCC"/>
               <w:start w:val="single" w:sz="2" w:space="0" w:color="CCCCCC"/>
@@ -2820,7 +2931,7 @@
         </w:tc>
         <w:tc>
           <w:tcPr>
-            <w:tcW w:w="5427" w:type="dxa"/>
+            <w:tcW w:w="5428" w:type="dxa"/>
             <w:tcBorders>
               <w:top w:val="single" w:sz="2" w:space="0" w:color="CCCCCC"/>
               <w:start w:val="single" w:sz="2" w:space="0" w:color="CCCCCC"/>
@@ -2854,7 +2965,7 @@
         <w:trPr/>
         <w:tc>
           <w:tcPr>
-            <w:tcW w:w="2199" w:type="dxa"/>
+            <w:tcW w:w="2198" w:type="dxa"/>
             <w:tcBorders>
               <w:top w:val="single" w:sz="2" w:space="0" w:color="CCCCCC"/>
               <w:start w:val="single" w:sz="2" w:space="0" w:color="CCCCCC"/>
@@ -2916,7 +3027,7 @@
         </w:tc>
         <w:tc>
           <w:tcPr>
-            <w:tcW w:w="5427" w:type="dxa"/>
+            <w:tcW w:w="5428" w:type="dxa"/>
             <w:tcBorders>
               <w:top w:val="single" w:sz="2" w:space="0" w:color="CCCCCC"/>
               <w:start w:val="single" w:sz="2" w:space="0" w:color="CCCCCC"/>
@@ -2950,7 +3061,7 @@
         <w:trPr/>
         <w:tc>
           <w:tcPr>
-            <w:tcW w:w="2199" w:type="dxa"/>
+            <w:tcW w:w="2198" w:type="dxa"/>
             <w:tcBorders>
               <w:top w:val="single" w:sz="2" w:space="0" w:color="CCCCCC"/>
               <w:start w:val="single" w:sz="2" w:space="0" w:color="CCCCCC"/>
@@ -3012,7 +3123,7 @@
         </w:tc>
         <w:tc>
           <w:tcPr>
-            <w:tcW w:w="5427" w:type="dxa"/>
+            <w:tcW w:w="5428" w:type="dxa"/>
             <w:tcBorders>
               <w:top w:val="single" w:sz="2" w:space="0" w:color="CCCCCC"/>
               <w:start w:val="single" w:sz="2" w:space="0" w:color="CCCCCC"/>
@@ -3046,7 +3157,7 @@
         <w:trPr/>
         <w:tc>
           <w:tcPr>
-            <w:tcW w:w="2199" w:type="dxa"/>
+            <w:tcW w:w="2198" w:type="dxa"/>
             <w:tcBorders>
               <w:top w:val="single" w:sz="2" w:space="0" w:color="CCCCCC"/>
               <w:start w:val="single" w:sz="2" w:space="0" w:color="CCCCCC"/>
@@ -3108,7 +3219,7 @@
         </w:tc>
         <w:tc>
           <w:tcPr>
-            <w:tcW w:w="5427" w:type="dxa"/>
+            <w:tcW w:w="5428" w:type="dxa"/>
             <w:tcBorders>
               <w:top w:val="single" w:sz="2" w:space="0" w:color="CCCCCC"/>
               <w:start w:val="single" w:sz="2" w:space="0" w:color="CCCCCC"/>
@@ -3142,7 +3253,7 @@
         <w:trPr/>
         <w:tc>
           <w:tcPr>
-            <w:tcW w:w="2199" w:type="dxa"/>
+            <w:tcW w:w="2198" w:type="dxa"/>
             <w:tcBorders>
               <w:top w:val="single" w:sz="2" w:space="0" w:color="CCCCCC"/>
               <w:start w:val="single" w:sz="2" w:space="0" w:color="CCCCCC"/>
@@ -3204,7 +3315,7 @@
         </w:tc>
         <w:tc>
           <w:tcPr>
-            <w:tcW w:w="5427" w:type="dxa"/>
+            <w:tcW w:w="5428" w:type="dxa"/>
             <w:tcBorders>
               <w:top w:val="single" w:sz="2" w:space="0" w:color="CCCCCC"/>
               <w:start w:val="single" w:sz="2" w:space="0" w:color="CCCCCC"/>
@@ -3238,7 +3349,7 @@
         <w:trPr/>
         <w:tc>
           <w:tcPr>
-            <w:tcW w:w="2199" w:type="dxa"/>
+            <w:tcW w:w="2198" w:type="dxa"/>
             <w:tcBorders>
               <w:top w:val="single" w:sz="2" w:space="0" w:color="CCCCCC"/>
               <w:start w:val="single" w:sz="2" w:space="0" w:color="CCCCCC"/>
@@ -3300,7 +3411,7 @@
         </w:tc>
         <w:tc>
           <w:tcPr>
-            <w:tcW w:w="5427" w:type="dxa"/>
+            <w:tcW w:w="5428" w:type="dxa"/>
             <w:tcBorders>
               <w:top w:val="single" w:sz="2" w:space="0" w:color="CCCCCC"/>
               <w:start w:val="single" w:sz="2" w:space="0" w:color="CCCCCC"/>
@@ -3334,7 +3445,7 @@
         <w:trPr/>
         <w:tc>
           <w:tcPr>
-            <w:tcW w:w="2199" w:type="dxa"/>
+            <w:tcW w:w="2198" w:type="dxa"/>
             <w:tcBorders>
               <w:top w:val="single" w:sz="2" w:space="0" w:color="CCCCCC"/>
               <w:start w:val="single" w:sz="2" w:space="0" w:color="CCCCCC"/>
@@ -3396,7 +3507,7 @@
         </w:tc>
         <w:tc>
           <w:tcPr>
-            <w:tcW w:w="5427" w:type="dxa"/>
+            <w:tcW w:w="5428" w:type="dxa"/>
             <w:tcBorders>
               <w:top w:val="single" w:sz="2" w:space="0" w:color="CCCCCC"/>
               <w:start w:val="single" w:sz="2" w:space="0" w:color="CCCCCC"/>
@@ -3430,7 +3541,7 @@
         <w:trPr/>
         <w:tc>
           <w:tcPr>
-            <w:tcW w:w="2199" w:type="dxa"/>
+            <w:tcW w:w="2198" w:type="dxa"/>
             <w:tcBorders>
               <w:top w:val="single" w:sz="2" w:space="0" w:color="CCCCCC"/>
               <w:start w:val="single" w:sz="2" w:space="0" w:color="CCCCCC"/>
@@ -3492,7 +3603,7 @@
         </w:tc>
         <w:tc>
           <w:tcPr>
-            <w:tcW w:w="5427" w:type="dxa"/>
+            <w:tcW w:w="5428" w:type="dxa"/>
             <w:tcBorders>
               <w:top w:val="single" w:sz="2" w:space="0" w:color="CCCCCC"/>
               <w:start w:val="single" w:sz="2" w:space="0" w:color="CCCCCC"/>
@@ -3526,7 +3637,7 @@
         <w:trPr/>
         <w:tc>
           <w:tcPr>
-            <w:tcW w:w="2199" w:type="dxa"/>
+            <w:tcW w:w="2198" w:type="dxa"/>
             <w:tcBorders>
               <w:top w:val="single" w:sz="2" w:space="0" w:color="CCCCCC"/>
               <w:start w:val="single" w:sz="2" w:space="0" w:color="CCCCCC"/>
@@ -3588,7 +3699,7 @@
         </w:tc>
         <w:tc>
           <w:tcPr>
-            <w:tcW w:w="5427" w:type="dxa"/>
+            <w:tcW w:w="5428" w:type="dxa"/>
             <w:tcBorders>
               <w:top w:val="single" w:sz="2" w:space="0" w:color="CCCCCC"/>
               <w:start w:val="single" w:sz="2" w:space="0" w:color="CCCCCC"/>
@@ -3622,7 +3733,7 @@
         <w:trPr/>
         <w:tc>
           <w:tcPr>
-            <w:tcW w:w="2199" w:type="dxa"/>
+            <w:tcW w:w="2198" w:type="dxa"/>
             <w:tcBorders>
               <w:top w:val="single" w:sz="2" w:space="0" w:color="CCCCCC"/>
               <w:start w:val="single" w:sz="2" w:space="0" w:color="CCCCCC"/>
@@ -3684,7 +3795,7 @@
         </w:tc>
         <w:tc>
           <w:tcPr>
-            <w:tcW w:w="5427" w:type="dxa"/>
+            <w:tcW w:w="5428" w:type="dxa"/>
             <w:tcBorders>
               <w:top w:val="single" w:sz="2" w:space="0" w:color="CCCCCC"/>
               <w:start w:val="single" w:sz="2" w:space="0" w:color="CCCCCC"/>
@@ -3718,7 +3829,7 @@
         <w:trPr/>
         <w:tc>
           <w:tcPr>
-            <w:tcW w:w="2199" w:type="dxa"/>
+            <w:tcW w:w="2198" w:type="dxa"/>
             <w:tcBorders>
               <w:top w:val="single" w:sz="2" w:space="0" w:color="CCCCCC"/>
               <w:start w:val="single" w:sz="2" w:space="0" w:color="CCCCCC"/>
@@ -3780,7 +3891,7 @@
         </w:tc>
         <w:tc>
           <w:tcPr>
-            <w:tcW w:w="5427" w:type="dxa"/>
+            <w:tcW w:w="5428" w:type="dxa"/>
             <w:tcBorders>
               <w:top w:val="single" w:sz="2" w:space="0" w:color="CCCCCC"/>
               <w:start w:val="single" w:sz="2" w:space="0" w:color="CCCCCC"/>
@@ -3834,7 +3945,7 @@
       </w:pPr>
       <w:r>
         <w:rPr>
-          <w:rFonts w:eastAsia="Arial" w:cs="Arial" w:ascii="Arial" w:hAnsi="Arial"/>
+          <w:rFonts w:eastAsia="Arial" w:cs="Arial"/>
           <w:b/>
           <w:bCs/>
           <w:color w:val="1A3A5C"/>
@@ -3852,7 +3963,7 @@
       </w:pPr>
       <w:r>
         <w:rPr>
-          <w:rFonts w:eastAsia="Arial" w:cs="Arial" w:ascii="Arial" w:hAnsi="Arial"/>
+          <w:rFonts w:eastAsia="Arial" w:cs="Arial"/>
           <w:b/>
           <w:bCs/>
           <w:color w:val="2E6DA4"/>
@@ -3885,7 +3996,7 @@
         <w:pStyle w:val="ListParagraph"/>
         <w:numPr>
           <w:ilvl w:val="0"/>
-          <w:numId w:val="1"/>
+          <w:numId w:val="2"/>
         </w:numPr>
         <w:spacing w:before="60" w:after="60"/>
         <w:rPr/>
@@ -3916,7 +4027,7 @@
         <w:pStyle w:val="ListParagraph"/>
         <w:numPr>
           <w:ilvl w:val="0"/>
-          <w:numId w:val="1"/>
+          <w:numId w:val="2"/>
         </w:numPr>
         <w:spacing w:before="60" w:after="60"/>
         <w:rPr/>
@@ -3947,7 +4058,7 @@
         <w:pStyle w:val="ListParagraph"/>
         <w:numPr>
           <w:ilvl w:val="0"/>
-          <w:numId w:val="1"/>
+          <w:numId w:val="2"/>
         </w:numPr>
         <w:spacing w:before="60" w:after="60"/>
         <w:rPr/>
@@ -3978,7 +4089,7 @@
         <w:pStyle w:val="ListParagraph"/>
         <w:numPr>
           <w:ilvl w:val="0"/>
-          <w:numId w:val="1"/>
+          <w:numId w:val="2"/>
         </w:numPr>
         <w:spacing w:before="60" w:after="60"/>
         <w:rPr/>
@@ -4009,7 +4120,7 @@
         <w:pStyle w:val="ListParagraph"/>
         <w:numPr>
           <w:ilvl w:val="0"/>
-          <w:numId w:val="1"/>
+          <w:numId w:val="2"/>
         </w:numPr>
         <w:spacing w:before="60" w:after="60"/>
         <w:rPr/>
@@ -4040,7 +4151,7 @@
         <w:pStyle w:val="ListParagraph"/>
         <w:numPr>
           <w:ilvl w:val="0"/>
-          <w:numId w:val="1"/>
+          <w:numId w:val="2"/>
         </w:numPr>
         <w:spacing w:before="60" w:after="60"/>
         <w:rPr/>
@@ -4102,7 +4213,7 @@
       </w:pPr>
       <w:r>
         <w:rPr>
-          <w:rFonts w:eastAsia="Arial" w:cs="Arial" w:ascii="Arial" w:hAnsi="Arial"/>
+          <w:rFonts w:eastAsia="Arial" w:cs="Arial"/>
           <w:b/>
           <w:bCs/>
           <w:color w:val="2E6DA4"/>
@@ -4135,7 +4246,7 @@
         <w:pStyle w:val="ListParagraph"/>
         <w:numPr>
           <w:ilvl w:val="0"/>
-          <w:numId w:val="1"/>
+          <w:numId w:val="2"/>
         </w:numPr>
         <w:spacing w:before="60" w:after="60"/>
         <w:rPr/>
@@ -4166,7 +4277,7 @@
         <w:pStyle w:val="ListParagraph"/>
         <w:numPr>
           <w:ilvl w:val="0"/>
-          <w:numId w:val="1"/>
+          <w:numId w:val="2"/>
         </w:numPr>
         <w:spacing w:before="60" w:after="60"/>
         <w:rPr/>
@@ -4197,7 +4308,7 @@
         <w:pStyle w:val="ListParagraph"/>
         <w:numPr>
           <w:ilvl w:val="0"/>
-          <w:numId w:val="1"/>
+          <w:numId w:val="2"/>
         </w:numPr>
         <w:spacing w:before="60" w:after="60"/>
         <w:rPr/>
@@ -4228,7 +4339,7 @@
         <w:pStyle w:val="ListParagraph"/>
         <w:numPr>
           <w:ilvl w:val="0"/>
-          <w:numId w:val="1"/>
+          <w:numId w:val="2"/>
         </w:numPr>
         <w:spacing w:before="60" w:after="60"/>
         <w:rPr/>
@@ -4259,7 +4370,7 @@
         <w:pStyle w:val="ListParagraph"/>
         <w:numPr>
           <w:ilvl w:val="0"/>
-          <w:numId w:val="1"/>
+          <w:numId w:val="2"/>
         </w:numPr>
         <w:spacing w:before="60" w:after="60"/>
         <w:rPr/>
@@ -4293,7 +4404,7 @@
       </w:pPr>
       <w:r>
         <w:rPr>
-          <w:rFonts w:eastAsia="Arial" w:cs="Arial" w:ascii="Arial" w:hAnsi="Arial"/>
+          <w:rFonts w:eastAsia="Arial" w:cs="Arial"/>
           <w:b/>
           <w:bCs/>
           <w:color w:val="2E6DA4"/>
@@ -4345,8 +4456,8 @@
         </w:tblCellMar>
       </w:tblPr>
       <w:tblGrid>
-        <w:gridCol w:w="1199"/>
-        <w:gridCol w:w="2801"/>
+        <w:gridCol w:w="1198"/>
+        <w:gridCol w:w="2802"/>
         <w:gridCol w:w="2400"/>
         <w:gridCol w:w="2626"/>
       </w:tblGrid>
@@ -4354,7 +4465,7 @@
         <w:trPr/>
         <w:tc>
           <w:tcPr>
-            <w:tcW w:w="1199" w:type="dxa"/>
+            <w:tcW w:w="1198" w:type="dxa"/>
             <w:tcBorders>
               <w:top w:val="single" w:sz="2" w:space="0" w:color="CCCCCC"/>
               <w:start w:val="single" w:sz="2" w:space="0" w:color="CCCCCC"/>
@@ -4385,7 +4496,7 @@
         </w:tc>
         <w:tc>
           <w:tcPr>
-            <w:tcW w:w="2801" w:type="dxa"/>
+            <w:tcW w:w="2802" w:type="dxa"/>
             <w:tcBorders>
               <w:top w:val="single" w:sz="2" w:space="0" w:color="CCCCCC"/>
               <w:start w:val="single" w:sz="2" w:space="0" w:color="CCCCCC"/>
@@ -4481,7 +4592,7 @@
         <w:trPr/>
         <w:tc>
           <w:tcPr>
-            <w:tcW w:w="1199" w:type="dxa"/>
+            <w:tcW w:w="1198" w:type="dxa"/>
             <w:tcBorders>
               <w:top w:val="single" w:sz="2" w:space="0" w:color="CCCCCC"/>
               <w:start w:val="single" w:sz="2" w:space="0" w:color="CCCCCC"/>
@@ -4512,7 +4623,7 @@
         </w:tc>
         <w:tc>
           <w:tcPr>
-            <w:tcW w:w="2801" w:type="dxa"/>
+            <w:tcW w:w="2802" w:type="dxa"/>
             <w:tcBorders>
               <w:top w:val="single" w:sz="2" w:space="0" w:color="CCCCCC"/>
               <w:start w:val="single" w:sz="2" w:space="0" w:color="CCCCCC"/>
@@ -4608,7 +4719,7 @@
         <w:trPr/>
         <w:tc>
           <w:tcPr>
-            <w:tcW w:w="1199" w:type="dxa"/>
+            <w:tcW w:w="1198" w:type="dxa"/>
             <w:tcBorders>
               <w:top w:val="single" w:sz="2" w:space="0" w:color="CCCCCC"/>
               <w:start w:val="single" w:sz="2" w:space="0" w:color="CCCCCC"/>
@@ -4639,7 +4750,7 @@
         </w:tc>
         <w:tc>
           <w:tcPr>
-            <w:tcW w:w="2801" w:type="dxa"/>
+            <w:tcW w:w="2802" w:type="dxa"/>
             <w:tcBorders>
               <w:top w:val="single" w:sz="2" w:space="0" w:color="CCCCCC"/>
               <w:start w:val="single" w:sz="2" w:space="0" w:color="CCCCCC"/>
@@ -4735,7 +4846,7 @@
         <w:trPr/>
         <w:tc>
           <w:tcPr>
-            <w:tcW w:w="1199" w:type="dxa"/>
+            <w:tcW w:w="1198" w:type="dxa"/>
             <w:tcBorders>
               <w:top w:val="single" w:sz="2" w:space="0" w:color="CCCCCC"/>
               <w:start w:val="single" w:sz="2" w:space="0" w:color="CCCCCC"/>
@@ -4766,7 +4877,7 @@
         </w:tc>
         <w:tc>
           <w:tcPr>
-            <w:tcW w:w="2801" w:type="dxa"/>
+            <w:tcW w:w="2802" w:type="dxa"/>
             <w:tcBorders>
               <w:top w:val="single" w:sz="2" w:space="0" w:color="CCCCCC"/>
               <w:start w:val="single" w:sz="2" w:space="0" w:color="CCCCCC"/>
@@ -4862,7 +4973,7 @@
         <w:trPr/>
         <w:tc>
           <w:tcPr>
-            <w:tcW w:w="1199" w:type="dxa"/>
+            <w:tcW w:w="1198" w:type="dxa"/>
             <w:tcBorders>
               <w:top w:val="single" w:sz="2" w:space="0" w:color="CCCCCC"/>
               <w:start w:val="single" w:sz="2" w:space="0" w:color="CCCCCC"/>
@@ -4893,7 +5004,7 @@
         </w:tc>
         <w:tc>
           <w:tcPr>
-            <w:tcW w:w="2801" w:type="dxa"/>
+            <w:tcW w:w="2802" w:type="dxa"/>
             <w:tcBorders>
               <w:top w:val="single" w:sz="2" w:space="0" w:color="CCCCCC"/>
               <w:start w:val="single" w:sz="2" w:space="0" w:color="CCCCCC"/>
@@ -5037,7 +5148,7 @@
       </w:pPr>
       <w:r>
         <w:rPr>
-          <w:rFonts w:eastAsia="Arial" w:cs="Arial" w:ascii="Arial" w:hAnsi="Arial"/>
+          <w:rFonts w:eastAsia="Arial" w:cs="Arial"/>
           <w:b/>
           <w:bCs/>
           <w:color w:val="1A3A5C"/>
@@ -5055,7 +5166,7 @@
       </w:pPr>
       <w:r>
         <w:rPr>
-          <w:rFonts w:eastAsia="Arial" w:cs="Arial" w:ascii="Arial" w:hAnsi="Arial"/>
+          <w:rFonts w:eastAsia="Arial" w:cs="Arial"/>
           <w:b/>
           <w:bCs/>
           <w:color w:val="2E6DA4"/>
@@ -5091,7 +5202,7 @@
       </w:pPr>
       <w:r>
         <w:rPr>
-          <w:rFonts w:eastAsia="Arial" w:cs="Arial" w:ascii="Arial" w:hAnsi="Arial"/>
+          <w:rFonts w:eastAsia="Arial" w:cs="Arial"/>
           <w:b/>
           <w:bCs/>
           <w:color w:val="2E6DA4"/>
@@ -5109,7 +5220,7 @@
       </w:pPr>
       <w:r>
         <w:rPr>
-          <w:rFonts w:eastAsia="Arial" w:cs="Arial" w:ascii="Arial" w:hAnsi="Arial"/>
+          <w:rFonts w:eastAsia="Arial" w:cs="Arial"/>
           <w:b/>
           <w:bCs/>
           <w:color w:val="2E6DA4"/>
@@ -5124,7 +5235,7 @@
         <w:pStyle w:val="ListParagraph"/>
         <w:numPr>
           <w:ilvl w:val="0"/>
-          <w:numId w:val="1"/>
+          <w:numId w:val="2"/>
         </w:numPr>
         <w:spacing w:before="60" w:after="60"/>
         <w:rPr/>
@@ -5155,7 +5266,7 @@
         <w:pStyle w:val="ListParagraph"/>
         <w:numPr>
           <w:ilvl w:val="0"/>
-          <w:numId w:val="1"/>
+          <w:numId w:val="2"/>
         </w:numPr>
         <w:spacing w:before="60" w:after="60"/>
         <w:rPr/>
@@ -5186,7 +5297,7 @@
         <w:pStyle w:val="ListParagraph"/>
         <w:numPr>
           <w:ilvl w:val="0"/>
-          <w:numId w:val="1"/>
+          <w:numId w:val="2"/>
         </w:numPr>
         <w:spacing w:before="60" w:after="60"/>
         <w:rPr/>
@@ -5217,7 +5328,7 @@
         <w:pStyle w:val="ListParagraph"/>
         <w:numPr>
           <w:ilvl w:val="0"/>
-          <w:numId w:val="1"/>
+          <w:numId w:val="2"/>
         </w:numPr>
         <w:spacing w:before="60" w:after="60"/>
         <w:rPr/>
@@ -5248,7 +5359,7 @@
         <w:pStyle w:val="ListParagraph"/>
         <w:numPr>
           <w:ilvl w:val="0"/>
-          <w:numId w:val="1"/>
+          <w:numId w:val="2"/>
         </w:numPr>
         <w:spacing w:before="60" w:after="60"/>
         <w:rPr/>
@@ -5279,7 +5390,7 @@
         <w:pStyle w:val="ListParagraph"/>
         <w:numPr>
           <w:ilvl w:val="0"/>
-          <w:numId w:val="1"/>
+          <w:numId w:val="2"/>
         </w:numPr>
         <w:spacing w:before="60" w:after="60"/>
         <w:rPr/>
@@ -5310,7 +5421,7 @@
         <w:pStyle w:val="ListParagraph"/>
         <w:numPr>
           <w:ilvl w:val="0"/>
-          <w:numId w:val="1"/>
+          <w:numId w:val="2"/>
         </w:numPr>
         <w:spacing w:before="60" w:after="60"/>
         <w:rPr/>
@@ -5354,7 +5465,7 @@
       </w:pPr>
       <w:r>
         <w:rPr>
-          <w:rFonts w:eastAsia="Arial" w:cs="Arial" w:ascii="Arial" w:hAnsi="Arial"/>
+          <w:rFonts w:eastAsia="Arial" w:cs="Arial"/>
           <w:b/>
           <w:bCs/>
           <w:color w:val="2E6DA4"/>
@@ -5390,7 +5501,7 @@
       </w:pPr>
       <w:r>
         <w:rPr>
-          <w:rFonts w:eastAsia="Arial" w:cs="Arial" w:ascii="Arial" w:hAnsi="Arial"/>
+          <w:rFonts w:eastAsia="Arial" w:cs="Arial"/>
           <w:b/>
           <w:bCs/>
           <w:color w:val="2E6DA4"/>
@@ -5444,7 +5555,7 @@
       </w:pPr>
       <w:r>
         <w:rPr>
-          <w:rFonts w:eastAsia="Arial" w:cs="Arial" w:ascii="Arial" w:hAnsi="Arial"/>
+          <w:rFonts w:eastAsia="Arial" w:cs="Arial"/>
           <w:b/>
           <w:bCs/>
           <w:color w:val="2E6DA4"/>
@@ -5459,7 +5570,7 @@
         <w:pStyle w:val="ListParagraph"/>
         <w:numPr>
           <w:ilvl w:val="0"/>
-          <w:numId w:val="1"/>
+          <w:numId w:val="2"/>
         </w:numPr>
         <w:spacing w:before="60" w:after="60"/>
         <w:rPr/>
@@ -5490,7 +5601,7 @@
         <w:pStyle w:val="ListParagraph"/>
         <w:numPr>
           <w:ilvl w:val="0"/>
-          <w:numId w:val="1"/>
+          <w:numId w:val="2"/>
         </w:numPr>
         <w:spacing w:before="60" w:after="60"/>
         <w:rPr/>
@@ -5521,7 +5632,7 @@
         <w:pStyle w:val="ListParagraph"/>
         <w:numPr>
           <w:ilvl w:val="0"/>
-          <w:numId w:val="1"/>
+          <w:numId w:val="2"/>
         </w:numPr>
         <w:spacing w:before="60" w:after="60"/>
         <w:rPr/>
@@ -5552,7 +5663,7 @@
         <w:pStyle w:val="ListParagraph"/>
         <w:numPr>
           <w:ilvl w:val="0"/>
-          <w:numId w:val="1"/>
+          <w:numId w:val="2"/>
         </w:numPr>
         <w:spacing w:before="60" w:after="60"/>
         <w:rPr/>
@@ -5586,7 +5697,7 @@
       </w:pPr>
       <w:r>
         <w:rPr>
-          <w:rFonts w:eastAsia="Arial" w:cs="Arial" w:ascii="Arial" w:hAnsi="Arial"/>
+          <w:rFonts w:eastAsia="Arial" w:cs="Arial"/>
           <w:b/>
           <w:bCs/>
           <w:color w:val="2E6DA4"/>
@@ -5622,7 +5733,7 @@
       </w:pPr>
       <w:r>
         <w:rPr>
-          <w:rFonts w:eastAsia="Arial" w:cs="Arial" w:ascii="Arial" w:hAnsi="Arial"/>
+          <w:rFonts w:eastAsia="Arial" w:cs="Arial"/>
           <w:b/>
           <w:bCs/>
           <w:color w:val="2E6DA4"/>
@@ -5656,17 +5767,17 @@
         </w:tblCellMar>
       </w:tblPr>
       <w:tblGrid>
-        <w:gridCol w:w="2199"/>
-        <w:gridCol w:w="1600"/>
+        <w:gridCol w:w="2198"/>
         <w:gridCol w:w="1601"/>
-        <w:gridCol w:w="1599"/>
-        <w:gridCol w:w="2027"/>
+        <w:gridCol w:w="1601"/>
+        <w:gridCol w:w="1598"/>
+        <w:gridCol w:w="2028"/>
       </w:tblGrid>
       <w:tr>
         <w:trPr/>
         <w:tc>
           <w:tcPr>
-            <w:tcW w:w="2199" w:type="dxa"/>
+            <w:tcW w:w="2198" w:type="dxa"/>
             <w:tcBorders>
               <w:top w:val="single" w:sz="2" w:space="0" w:color="CCCCCC"/>
               <w:start w:val="single" w:sz="2" w:space="0" w:color="CCCCCC"/>
@@ -5697,7 +5808,7 @@
         </w:tc>
         <w:tc>
           <w:tcPr>
-            <w:tcW w:w="1600" w:type="dxa"/>
+            <w:tcW w:w="1601" w:type="dxa"/>
             <w:tcBorders>
               <w:top w:val="single" w:sz="2" w:space="0" w:color="CCCCCC"/>
               <w:start w:val="single" w:sz="2" w:space="0" w:color="CCCCCC"/>
@@ -5759,7 +5870,7 @@
         </w:tc>
         <w:tc>
           <w:tcPr>
-            <w:tcW w:w="1599" w:type="dxa"/>
+            <w:tcW w:w="1598" w:type="dxa"/>
             <w:tcBorders>
               <w:top w:val="single" w:sz="2" w:space="0" w:color="CCCCCC"/>
               <w:start w:val="single" w:sz="2" w:space="0" w:color="CCCCCC"/>
@@ -5790,7 +5901,7 @@
         </w:tc>
         <w:tc>
           <w:tcPr>
-            <w:tcW w:w="2027" w:type="dxa"/>
+            <w:tcW w:w="2028" w:type="dxa"/>
             <w:tcBorders>
               <w:top w:val="single" w:sz="2" w:space="0" w:color="CCCCCC"/>
               <w:start w:val="single" w:sz="2" w:space="0" w:color="CCCCCC"/>
@@ -5824,7 +5935,7 @@
         <w:trPr/>
         <w:tc>
           <w:tcPr>
-            <w:tcW w:w="2199" w:type="dxa"/>
+            <w:tcW w:w="2198" w:type="dxa"/>
             <w:tcBorders>
               <w:top w:val="single" w:sz="2" w:space="0" w:color="CCCCCC"/>
               <w:start w:val="single" w:sz="2" w:space="0" w:color="CCCCCC"/>
@@ -5855,7 +5966,7 @@
         </w:tc>
         <w:tc>
           <w:tcPr>
-            <w:tcW w:w="1600" w:type="dxa"/>
+            <w:tcW w:w="1601" w:type="dxa"/>
             <w:tcBorders>
               <w:top w:val="single" w:sz="2" w:space="0" w:color="CCCCCC"/>
               <w:start w:val="single" w:sz="2" w:space="0" w:color="CCCCCC"/>
@@ -5917,7 +6028,7 @@
         </w:tc>
         <w:tc>
           <w:tcPr>
-            <w:tcW w:w="1599" w:type="dxa"/>
+            <w:tcW w:w="1598" w:type="dxa"/>
             <w:tcBorders>
               <w:top w:val="single" w:sz="2" w:space="0" w:color="CCCCCC"/>
               <w:start w:val="single" w:sz="2" w:space="0" w:color="CCCCCC"/>
@@ -5948,7 +6059,7 @@
         </w:tc>
         <w:tc>
           <w:tcPr>
-            <w:tcW w:w="2027" w:type="dxa"/>
+            <w:tcW w:w="2028" w:type="dxa"/>
             <w:tcBorders>
               <w:top w:val="single" w:sz="2" w:space="0" w:color="CCCCCC"/>
               <w:start w:val="single" w:sz="2" w:space="0" w:color="CCCCCC"/>
@@ -5982,7 +6093,7 @@
         <w:trPr/>
         <w:tc>
           <w:tcPr>
-            <w:tcW w:w="2199" w:type="dxa"/>
+            <w:tcW w:w="2198" w:type="dxa"/>
             <w:tcBorders>
               <w:top w:val="single" w:sz="2" w:space="0" w:color="CCCCCC"/>
               <w:start w:val="single" w:sz="2" w:space="0" w:color="CCCCCC"/>
@@ -6013,7 +6124,7 @@
         </w:tc>
         <w:tc>
           <w:tcPr>
-            <w:tcW w:w="1600" w:type="dxa"/>
+            <w:tcW w:w="1601" w:type="dxa"/>
             <w:tcBorders>
               <w:top w:val="single" w:sz="2" w:space="0" w:color="CCCCCC"/>
               <w:start w:val="single" w:sz="2" w:space="0" w:color="CCCCCC"/>
@@ -6075,7 +6186,7 @@
         </w:tc>
         <w:tc>
           <w:tcPr>
-            <w:tcW w:w="1599" w:type="dxa"/>
+            <w:tcW w:w="1598" w:type="dxa"/>
             <w:tcBorders>
               <w:top w:val="single" w:sz="2" w:space="0" w:color="CCCCCC"/>
               <w:start w:val="single" w:sz="2" w:space="0" w:color="CCCCCC"/>
@@ -6106,7 +6217,7 @@
         </w:tc>
         <w:tc>
           <w:tcPr>
-            <w:tcW w:w="2027" w:type="dxa"/>
+            <w:tcW w:w="2028" w:type="dxa"/>
             <w:tcBorders>
               <w:top w:val="single" w:sz="2" w:space="0" w:color="CCCCCC"/>
               <w:start w:val="single" w:sz="2" w:space="0" w:color="CCCCCC"/>
@@ -6140,7 +6251,7 @@
         <w:trPr/>
         <w:tc>
           <w:tcPr>
-            <w:tcW w:w="2199" w:type="dxa"/>
+            <w:tcW w:w="2198" w:type="dxa"/>
             <w:tcBorders>
               <w:top w:val="single" w:sz="2" w:space="0" w:color="CCCCCC"/>
               <w:start w:val="single" w:sz="2" w:space="0" w:color="CCCCCC"/>
@@ -6171,7 +6282,7 @@
         </w:tc>
         <w:tc>
           <w:tcPr>
-            <w:tcW w:w="1600" w:type="dxa"/>
+            <w:tcW w:w="1601" w:type="dxa"/>
             <w:tcBorders>
               <w:top w:val="single" w:sz="2" w:space="0" w:color="CCCCCC"/>
               <w:start w:val="single" w:sz="2" w:space="0" w:color="CCCCCC"/>
@@ -6233,7 +6344,7 @@
         </w:tc>
         <w:tc>
           <w:tcPr>
-            <w:tcW w:w="1599" w:type="dxa"/>
+            <w:tcW w:w="1598" w:type="dxa"/>
             <w:tcBorders>
               <w:top w:val="single" w:sz="2" w:space="0" w:color="CCCCCC"/>
               <w:start w:val="single" w:sz="2" w:space="0" w:color="CCCCCC"/>
@@ -6264,7 +6375,7 @@
         </w:tc>
         <w:tc>
           <w:tcPr>
-            <w:tcW w:w="2027" w:type="dxa"/>
+            <w:tcW w:w="2028" w:type="dxa"/>
             <w:tcBorders>
               <w:top w:val="single" w:sz="2" w:space="0" w:color="CCCCCC"/>
               <w:start w:val="single" w:sz="2" w:space="0" w:color="CCCCCC"/>
@@ -6331,7 +6442,7 @@
       </w:pPr>
       <w:r>
         <w:rPr>
-          <w:rFonts w:eastAsia="Arial" w:cs="Arial" w:ascii="Arial" w:hAnsi="Arial"/>
+          <w:rFonts w:eastAsia="Arial" w:cs="Arial"/>
           <w:b/>
           <w:bCs/>
           <w:color w:val="2E6DA4"/>
@@ -6367,7 +6478,7 @@
       </w:pPr>
       <w:r>
         <w:rPr>
-          <w:rFonts w:eastAsia="Arial" w:cs="Arial" w:ascii="Arial" w:hAnsi="Arial"/>
+          <w:rFonts w:eastAsia="Arial" w:cs="Arial"/>
           <w:b/>
           <w:bCs/>
           <w:color w:val="2E6DA4"/>
@@ -6753,7 +6864,7 @@
       </w:pPr>
       <w:r>
         <w:rPr>
-          <w:rFonts w:eastAsia="Arial" w:cs="Arial" w:ascii="Arial" w:hAnsi="Arial"/>
+          <w:rFonts w:eastAsia="Arial" w:cs="Arial"/>
           <w:b/>
           <w:bCs/>
           <w:color w:val="1A3A5C"/>
@@ -6771,7 +6882,7 @@
       </w:pPr>
       <w:r>
         <w:rPr>
-          <w:rFonts w:eastAsia="Arial" w:cs="Arial" w:ascii="Arial" w:hAnsi="Arial"/>
+          <w:rFonts w:eastAsia="Arial" w:cs="Arial"/>
           <w:b/>
           <w:bCs/>
           <w:color w:val="2E6DA4"/>
@@ -6804,7 +6915,7 @@
         <w:pStyle w:val="ListParagraph"/>
         <w:numPr>
           <w:ilvl w:val="0"/>
-          <w:numId w:val="1"/>
+          <w:numId w:val="2"/>
         </w:numPr>
         <w:spacing w:before="60" w:after="60"/>
         <w:rPr/>
@@ -6835,7 +6946,7 @@
         <w:pStyle w:val="ListParagraph"/>
         <w:numPr>
           <w:ilvl w:val="0"/>
-          <w:numId w:val="1"/>
+          <w:numId w:val="2"/>
         </w:numPr>
         <w:spacing w:before="60" w:after="60"/>
         <w:rPr/>
@@ -6866,7 +6977,7 @@
         <w:pStyle w:val="ListParagraph"/>
         <w:numPr>
           <w:ilvl w:val="0"/>
-          <w:numId w:val="1"/>
+          <w:numId w:val="2"/>
         </w:numPr>
         <w:spacing w:before="60" w:after="60"/>
         <w:rPr/>
@@ -6928,7 +7039,7 @@
       </w:pPr>
       <w:r>
         <w:rPr>
-          <w:rFonts w:eastAsia="Arial" w:cs="Arial" w:ascii="Arial" w:hAnsi="Arial"/>
+          <w:rFonts w:eastAsia="Arial" w:cs="Arial"/>
           <w:b/>
           <w:bCs/>
           <w:color w:val="2E6DA4"/>
@@ -6961,7 +7072,7 @@
         <w:pStyle w:val="ListParagraph"/>
         <w:numPr>
           <w:ilvl w:val="0"/>
-          <w:numId w:val="1"/>
+          <w:numId w:val="2"/>
         </w:numPr>
         <w:spacing w:before="60" w:after="60"/>
         <w:rPr/>
@@ -6992,7 +7103,7 @@
         <w:pStyle w:val="ListParagraph"/>
         <w:numPr>
           <w:ilvl w:val="0"/>
-          <w:numId w:val="1"/>
+          <w:numId w:val="2"/>
         </w:numPr>
         <w:spacing w:before="60" w:after="60"/>
         <w:rPr/>
@@ -7023,7 +7134,7 @@
         <w:pStyle w:val="ListParagraph"/>
         <w:numPr>
           <w:ilvl w:val="0"/>
-          <w:numId w:val="1"/>
+          <w:numId w:val="2"/>
         </w:numPr>
         <w:spacing w:before="60" w:after="60"/>
         <w:rPr/>
@@ -7054,7 +7165,7 @@
         <w:pStyle w:val="ListParagraph"/>
         <w:numPr>
           <w:ilvl w:val="0"/>
-          <w:numId w:val="1"/>
+          <w:numId w:val="2"/>
         </w:numPr>
         <w:spacing w:before="60" w:after="60"/>
         <w:rPr/>
@@ -7085,7 +7196,7 @@
         <w:pStyle w:val="ListParagraph"/>
         <w:numPr>
           <w:ilvl w:val="0"/>
-          <w:numId w:val="1"/>
+          <w:numId w:val="2"/>
         </w:numPr>
         <w:spacing w:before="60" w:after="60"/>
         <w:rPr/>
@@ -7119,7 +7230,7 @@
       </w:pPr>
       <w:r>
         <w:rPr>
-          <w:rFonts w:eastAsia="Arial" w:cs="Arial" w:ascii="Arial" w:hAnsi="Arial"/>
+          <w:rFonts w:eastAsia="Arial" w:cs="Arial"/>
           <w:b/>
           <w:bCs/>
           <w:color w:val="2E6DA4"/>
@@ -7152,7 +7263,7 @@
         <w:pStyle w:val="ListParagraph"/>
         <w:numPr>
           <w:ilvl w:val="0"/>
-          <w:numId w:val="1"/>
+          <w:numId w:val="2"/>
         </w:numPr>
         <w:spacing w:before="60" w:after="60"/>
         <w:rPr/>
@@ -7183,7 +7294,7 @@
         <w:pStyle w:val="ListParagraph"/>
         <w:numPr>
           <w:ilvl w:val="0"/>
-          <w:numId w:val="1"/>
+          <w:numId w:val="2"/>
         </w:numPr>
         <w:spacing w:before="60" w:after="60"/>
         <w:rPr/>
@@ -7245,7 +7356,7 @@
       </w:pPr>
       <w:r>
         <w:rPr>
-          <w:rFonts w:eastAsia="Arial" w:cs="Arial" w:ascii="Arial" w:hAnsi="Arial"/>
+          <w:rFonts w:eastAsia="Arial" w:cs="Arial"/>
           <w:b/>
           <w:bCs/>
           <w:color w:val="2E6DA4"/>
@@ -7296,7 +7407,7 @@
       </w:pPr>
       <w:r>
         <w:rPr>
-          <w:rFonts w:eastAsia="Arial" w:cs="Arial" w:ascii="Arial" w:hAnsi="Arial"/>
+          <w:rFonts w:eastAsia="Arial" w:cs="Arial"/>
           <w:b/>
           <w:bCs/>
           <w:color w:val="1A3A5C"/>
@@ -7314,7 +7425,7 @@
       </w:pPr>
       <w:r>
         <w:rPr>
-          <w:rFonts w:eastAsia="Arial" w:cs="Arial" w:ascii="Arial" w:hAnsi="Arial"/>
+          <w:rFonts w:eastAsia="Arial" w:cs="Arial"/>
           <w:b/>
           <w:bCs/>
           <w:color w:val="2E6DA4"/>
@@ -7350,7 +7461,7 @@
       </w:pPr>
       <w:r>
         <w:rPr>
-          <w:rFonts w:eastAsia="Arial" w:cs="Arial" w:ascii="Arial" w:hAnsi="Arial"/>
+          <w:rFonts w:eastAsia="Arial" w:cs="Arial"/>
           <w:b/>
           <w:bCs/>
           <w:color w:val="2E6DA4"/>
@@ -7973,7 +8084,7 @@
       </w:pPr>
       <w:r>
         <w:rPr>
-          <w:rFonts w:eastAsia="Arial" w:cs="Arial" w:ascii="Arial" w:hAnsi="Arial"/>
+          <w:rFonts w:eastAsia="Arial" w:cs="Arial"/>
           <w:b/>
           <w:bCs/>
           <w:color w:val="2E6DA4"/>
@@ -8007,15 +8118,15 @@
         </w:tblCellMar>
       </w:tblPr>
       <w:tblGrid>
-        <w:gridCol w:w="5025"/>
+        <w:gridCol w:w="5024"/>
         <w:gridCol w:w="2000"/>
-        <w:gridCol w:w="2001"/>
+        <w:gridCol w:w="2002"/>
       </w:tblGrid>
       <w:tr>
         <w:trPr/>
         <w:tc>
           <w:tcPr>
-            <w:tcW w:w="5025" w:type="dxa"/>
+            <w:tcW w:w="5024" w:type="dxa"/>
             <w:tcBorders>
               <w:top w:val="single" w:sz="2" w:space="0" w:color="CCCCCC"/>
               <w:start w:val="single" w:sz="2" w:space="0" w:color="CCCCCC"/>
@@ -8077,7 +8188,7 @@
         </w:tc>
         <w:tc>
           <w:tcPr>
-            <w:tcW w:w="2001" w:type="dxa"/>
+            <w:tcW w:w="2002" w:type="dxa"/>
             <w:tcBorders>
               <w:top w:val="single" w:sz="2" w:space="0" w:color="CCCCCC"/>
               <w:start w:val="single" w:sz="2" w:space="0" w:color="CCCCCC"/>
@@ -8111,7 +8222,7 @@
         <w:trPr/>
         <w:tc>
           <w:tcPr>
-            <w:tcW w:w="5025" w:type="dxa"/>
+            <w:tcW w:w="5024" w:type="dxa"/>
             <w:tcBorders>
               <w:top w:val="single" w:sz="2" w:space="0" w:color="CCCCCC"/>
               <w:start w:val="single" w:sz="2" w:space="0" w:color="CCCCCC"/>
@@ -8173,7 +8284,7 @@
         </w:tc>
         <w:tc>
           <w:tcPr>
-            <w:tcW w:w="2001" w:type="dxa"/>
+            <w:tcW w:w="2002" w:type="dxa"/>
             <w:tcBorders>
               <w:top w:val="single" w:sz="2" w:space="0" w:color="CCCCCC"/>
               <w:start w:val="single" w:sz="2" w:space="0" w:color="CCCCCC"/>
@@ -8207,7 +8318,7 @@
         <w:trPr/>
         <w:tc>
           <w:tcPr>
-            <w:tcW w:w="5025" w:type="dxa"/>
+            <w:tcW w:w="5024" w:type="dxa"/>
             <w:tcBorders>
               <w:top w:val="single" w:sz="2" w:space="0" w:color="CCCCCC"/>
               <w:start w:val="single" w:sz="2" w:space="0" w:color="CCCCCC"/>
@@ -8269,7 +8380,7 @@
         </w:tc>
         <w:tc>
           <w:tcPr>
-            <w:tcW w:w="2001" w:type="dxa"/>
+            <w:tcW w:w="2002" w:type="dxa"/>
             <w:tcBorders>
               <w:top w:val="single" w:sz="2" w:space="0" w:color="CCCCCC"/>
               <w:start w:val="single" w:sz="2" w:space="0" w:color="CCCCCC"/>
@@ -8303,7 +8414,7 @@
         <w:trPr/>
         <w:tc>
           <w:tcPr>
-            <w:tcW w:w="5025" w:type="dxa"/>
+            <w:tcW w:w="5024" w:type="dxa"/>
             <w:tcBorders>
               <w:top w:val="single" w:sz="2" w:space="0" w:color="CCCCCC"/>
               <w:start w:val="single" w:sz="2" w:space="0" w:color="CCCCCC"/>
@@ -8365,7 +8476,7 @@
         </w:tc>
         <w:tc>
           <w:tcPr>
-            <w:tcW w:w="2001" w:type="dxa"/>
+            <w:tcW w:w="2002" w:type="dxa"/>
             <w:tcBorders>
               <w:top w:val="single" w:sz="2" w:space="0" w:color="CCCCCC"/>
               <w:start w:val="single" w:sz="2" w:space="0" w:color="CCCCCC"/>
@@ -8399,7 +8510,7 @@
         <w:trPr/>
         <w:tc>
           <w:tcPr>
-            <w:tcW w:w="5025" w:type="dxa"/>
+            <w:tcW w:w="5024" w:type="dxa"/>
             <w:tcBorders>
               <w:top w:val="single" w:sz="2" w:space="0" w:color="CCCCCC"/>
               <w:start w:val="single" w:sz="2" w:space="0" w:color="CCCCCC"/>
@@ -8461,7 +8572,7 @@
         </w:tc>
         <w:tc>
           <w:tcPr>
-            <w:tcW w:w="2001" w:type="dxa"/>
+            <w:tcW w:w="2002" w:type="dxa"/>
             <w:tcBorders>
               <w:top w:val="single" w:sz="2" w:space="0" w:color="CCCCCC"/>
               <w:start w:val="single" w:sz="2" w:space="0" w:color="CCCCCC"/>
@@ -8495,7 +8606,7 @@
         <w:trPr/>
         <w:tc>
           <w:tcPr>
-            <w:tcW w:w="5025" w:type="dxa"/>
+            <w:tcW w:w="5024" w:type="dxa"/>
             <w:tcBorders>
               <w:top w:val="single" w:sz="2" w:space="0" w:color="CCCCCC"/>
               <w:start w:val="single" w:sz="2" w:space="0" w:color="CCCCCC"/>
@@ -8557,7 +8668,7 @@
         </w:tc>
         <w:tc>
           <w:tcPr>
-            <w:tcW w:w="2001" w:type="dxa"/>
+            <w:tcW w:w="2002" w:type="dxa"/>
             <w:tcBorders>
               <w:top w:val="single" w:sz="2" w:space="0" w:color="CCCCCC"/>
               <w:start w:val="single" w:sz="2" w:space="0" w:color="CCCCCC"/>
@@ -8591,7 +8702,7 @@
         <w:trPr/>
         <w:tc>
           <w:tcPr>
-            <w:tcW w:w="5025" w:type="dxa"/>
+            <w:tcW w:w="5024" w:type="dxa"/>
             <w:tcBorders>
               <w:top w:val="single" w:sz="2" w:space="0" w:color="CCCCCC"/>
               <w:start w:val="single" w:sz="2" w:space="0" w:color="CCCCCC"/>
@@ -8653,7 +8764,7 @@
         </w:tc>
         <w:tc>
           <w:tcPr>
-            <w:tcW w:w="2001" w:type="dxa"/>
+            <w:tcW w:w="2002" w:type="dxa"/>
             <w:tcBorders>
               <w:top w:val="single" w:sz="2" w:space="0" w:color="CCCCCC"/>
               <w:start w:val="single" w:sz="2" w:space="0" w:color="CCCCCC"/>
@@ -8687,7 +8798,7 @@
         <w:trPr/>
         <w:tc>
           <w:tcPr>
-            <w:tcW w:w="5025" w:type="dxa"/>
+            <w:tcW w:w="5024" w:type="dxa"/>
             <w:tcBorders>
               <w:top w:val="single" w:sz="2" w:space="0" w:color="CCCCCC"/>
               <w:start w:val="single" w:sz="2" w:space="0" w:color="CCCCCC"/>
@@ -8749,7 +8860,7 @@
         </w:tc>
         <w:tc>
           <w:tcPr>
-            <w:tcW w:w="2001" w:type="dxa"/>
+            <w:tcW w:w="2002" w:type="dxa"/>
             <w:tcBorders>
               <w:top w:val="single" w:sz="2" w:space="0" w:color="CCCCCC"/>
               <w:start w:val="single" w:sz="2" w:space="0" w:color="CCCCCC"/>
@@ -8822,7 +8933,7 @@
       </w:pPr>
       <w:r>
         <w:rPr>
-          <w:rFonts w:eastAsia="Arial" w:cs="Arial" w:ascii="Arial" w:hAnsi="Arial"/>
+          <w:rFonts w:eastAsia="Arial" w:cs="Arial"/>
           <w:b/>
           <w:bCs/>
           <w:color w:val="2E6DA4"/>
@@ -8845,53 +8956,6 @@
         </w:rPr>
       </w:pPr>
       <w:r>
-        <w:rPr>
-          <w:rFonts w:eastAsia="Arial" w:cs="Arial" w:ascii="Arial" w:hAnsi="Arial"/>
-          <w:b/>
-          <w:bCs/>
-          <w:color w:val="2E6DA4"/>
-          <w:sz w:val="24"/>
-          <w:szCs w:val="24"/>
-        </w:rPr>
-        <w:t>7.4 Estrutura do Repositório</w:t>
-      </w:r>
-    </w:p>
-    <w:p>
-      <w:pPr>
-        <w:pStyle w:val="Normal"/>
-        <w:spacing w:before="80" w:after="80"/>
-        <w:ind w:firstLine="720"/>
-        <w:jc w:val="both"/>
-        <w:rPr/>
-      </w:pPr>
-      <w:r>
-        <w:rPr>
-          <w:rFonts w:eastAsia="Times New Roman" w:cs="Times New Roman"/>
-          <w:color w:val="333333"/>
-          <w:sz w:val="24"/>
-          <w:szCs w:val="24"/>
-        </w:rPr>
-        <w:t xml:space="preserve">Todo o material do projeto está centralizado em pasta compartilhada no GitHub, compartilhada com o professor com permissão de leitura. Link do repositório: </w:t>
-      </w:r>
-      <w:hyperlink r:id="rId2">
-        <w:r>
-          <w:rPr>
-            <w:rStyle w:val="Hyperlink"/>
-          </w:rPr>
-          <w:t>https://github.com/robert-sampaio/medfacil</w:t>
-        </w:r>
-      </w:hyperlink>
-      <w:r>
-        <w:rPr/>
-        <w:t xml:space="preserve"> .</w:t>
-      </w:r>
-    </w:p>
-    <w:p>
-      <w:pPr>
-        <w:pStyle w:val="Normal"/>
-        <w:rPr/>
-      </w:pPr>
-      <w:r>
         <w:rPr/>
       </w:r>
       <w:r>
@@ -8909,7 +8973,7 @@
       </w:pPr>
       <w:r>
         <w:rPr>
-          <w:rFonts w:eastAsia="Arial" w:cs="Arial" w:ascii="Arial" w:hAnsi="Arial"/>
+          <w:rFonts w:eastAsia="Arial" w:cs="Arial"/>
           <w:b/>
           <w:bCs/>
           <w:color w:val="1A3A5C"/>
@@ -9014,7 +9078,7 @@
       </w:pPr>
       <w:r>
         <w:rPr>
-          <w:rFonts w:eastAsia="Arial" w:cs="Arial" w:ascii="Arial" w:hAnsi="Arial"/>
+          <w:rFonts w:eastAsia="Arial" w:cs="Arial"/>
           <w:b/>
           <w:bCs/>
           <w:color w:val="1A3A5C"/>
@@ -9299,6 +9363,7 @@
         </w:tabs>
         <w:ind w:start="1080" w:hanging="360"/>
       </w:pPr>
+      <w:rPr/>
     </w:lvl>
     <w:lvl w:ilvl="2">
       <w:start w:val="1"/>
@@ -9311,6 +9376,7 @@
         </w:tabs>
         <w:ind w:start="1440" w:hanging="360"/>
       </w:pPr>
+      <w:rPr/>
     </w:lvl>
     <w:lvl w:ilvl="3">
       <w:start w:val="1"/>
@@ -9323,6 +9389,7 @@
         </w:tabs>
         <w:ind w:start="1800" w:hanging="360"/>
       </w:pPr>
+      <w:rPr/>
     </w:lvl>
     <w:lvl w:ilvl="4">
       <w:start w:val="1"/>
@@ -9335,6 +9402,7 @@
         </w:tabs>
         <w:ind w:start="2160" w:hanging="360"/>
       </w:pPr>
+      <w:rPr/>
     </w:lvl>
     <w:lvl w:ilvl="5">
       <w:start w:val="1"/>
@@ -9347,6 +9415,7 @@
         </w:tabs>
         <w:ind w:start="2520" w:hanging="360"/>
       </w:pPr>
+      <w:rPr/>
     </w:lvl>
     <w:lvl w:ilvl="6">
       <w:start w:val="1"/>
@@ -9359,6 +9428,7 @@
         </w:tabs>
         <w:ind w:start="2880" w:hanging="360"/>
       </w:pPr>
+      <w:rPr/>
     </w:lvl>
     <w:lvl w:ilvl="7">
       <w:start w:val="1"/>
@@ -9371,6 +9441,7 @@
         </w:tabs>
         <w:ind w:start="3240" w:hanging="360"/>
       </w:pPr>
+      <w:rPr/>
     </w:lvl>
     <w:lvl w:ilvl="8">
       <w:start w:val="1"/>
@@ -9383,9 +9454,131 @@
         </w:tabs>
         <w:ind w:start="3600" w:hanging="360"/>
       </w:pPr>
+      <w:rPr/>
     </w:lvl>
   </w:abstractNum>
   <w:abstractNum w:abstractNumId="2">
+    <w:lvl w:ilvl="0">
+      <w:start w:val="1"/>
+      <w:numFmt w:val="bullet"/>
+      <w:lvlText w:val=""/>
+      <w:lvlJc w:val="start"/>
+      <w:pPr>
+        <w:tabs>
+          <w:tab w:val="num" w:pos="0"/>
+        </w:tabs>
+        <w:ind w:start="720" w:hanging="360"/>
+      </w:pPr>
+      <w:rPr>
+        <w:rFonts w:ascii="Symbol" w:hAnsi="Symbol" w:cs="Symbol" w:hint="default"/>
+      </w:rPr>
+    </w:lvl>
+    <w:lvl w:ilvl="1">
+      <w:start w:val="1"/>
+      <w:numFmt w:val="decimal"/>
+      <w:lvlText w:val="%2."/>
+      <w:lvlJc w:val="start"/>
+      <w:pPr>
+        <w:tabs>
+          <w:tab w:val="num" w:pos="1080"/>
+        </w:tabs>
+        <w:ind w:start="1080" w:hanging="360"/>
+      </w:pPr>
+      <w:rPr/>
+    </w:lvl>
+    <w:lvl w:ilvl="2">
+      <w:start w:val="1"/>
+      <w:numFmt w:val="decimal"/>
+      <w:lvlText w:val="%3."/>
+      <w:lvlJc w:val="start"/>
+      <w:pPr>
+        <w:tabs>
+          <w:tab w:val="num" w:pos="1440"/>
+        </w:tabs>
+        <w:ind w:start="1440" w:hanging="360"/>
+      </w:pPr>
+      <w:rPr/>
+    </w:lvl>
+    <w:lvl w:ilvl="3">
+      <w:start w:val="1"/>
+      <w:numFmt w:val="decimal"/>
+      <w:lvlText w:val="%4."/>
+      <w:lvlJc w:val="start"/>
+      <w:pPr>
+        <w:tabs>
+          <w:tab w:val="num" w:pos="1800"/>
+        </w:tabs>
+        <w:ind w:start="1800" w:hanging="360"/>
+      </w:pPr>
+      <w:rPr/>
+    </w:lvl>
+    <w:lvl w:ilvl="4">
+      <w:start w:val="1"/>
+      <w:numFmt w:val="decimal"/>
+      <w:lvlText w:val="%5."/>
+      <w:lvlJc w:val="start"/>
+      <w:pPr>
+        <w:tabs>
+          <w:tab w:val="num" w:pos="2160"/>
+        </w:tabs>
+        <w:ind w:start="2160" w:hanging="360"/>
+      </w:pPr>
+      <w:rPr/>
+    </w:lvl>
+    <w:lvl w:ilvl="5">
+      <w:start w:val="1"/>
+      <w:numFmt w:val="decimal"/>
+      <w:lvlText w:val="%6."/>
+      <w:lvlJc w:val="start"/>
+      <w:pPr>
+        <w:tabs>
+          <w:tab w:val="num" w:pos="2520"/>
+        </w:tabs>
+        <w:ind w:start="2520" w:hanging="360"/>
+      </w:pPr>
+      <w:rPr/>
+    </w:lvl>
+    <w:lvl w:ilvl="6">
+      <w:start w:val="1"/>
+      <w:numFmt w:val="decimal"/>
+      <w:lvlText w:val="%7."/>
+      <w:lvlJc w:val="start"/>
+      <w:pPr>
+        <w:tabs>
+          <w:tab w:val="num" w:pos="2880"/>
+        </w:tabs>
+        <w:ind w:start="2880" w:hanging="360"/>
+      </w:pPr>
+      <w:rPr/>
+    </w:lvl>
+    <w:lvl w:ilvl="7">
+      <w:start w:val="1"/>
+      <w:numFmt w:val="decimal"/>
+      <w:lvlText w:val="%8."/>
+      <w:lvlJc w:val="start"/>
+      <w:pPr>
+        <w:tabs>
+          <w:tab w:val="num" w:pos="3240"/>
+        </w:tabs>
+        <w:ind w:start="3240" w:hanging="360"/>
+      </w:pPr>
+      <w:rPr/>
+    </w:lvl>
+    <w:lvl w:ilvl="8">
+      <w:start w:val="1"/>
+      <w:numFmt w:val="decimal"/>
+      <w:lvlText w:val="%9."/>
+      <w:lvlJc w:val="start"/>
+      <w:pPr>
+        <w:tabs>
+          <w:tab w:val="num" w:pos="3600"/>
+        </w:tabs>
+        <w:ind w:start="3600" w:hanging="360"/>
+      </w:pPr>
+      <w:rPr/>
+    </w:lvl>
+  </w:abstractNum>
+  <w:abstractNum w:abstractNumId="3">
     <w:lvl w:ilvl="0">
       <w:start w:val="1"/>
       <w:numFmt w:val="none"/>
@@ -9511,7 +9704,10 @@
     <w:abstractNumId w:val="2"/>
   </w:num>
   <w:num w:numId="3">
-    <w:abstractNumId w:val="1"/>
+    <w:abstractNumId w:val="3"/>
+  </w:num>
+  <w:num w:numId="4">
+    <w:abstractNumId w:val="2"/>
     <w:lvlOverride w:ilvl="0">
       <w:startOverride w:val="1"/>
     </w:lvlOverride>
@@ -9541,6 +9737,7 @@
     <w:qFormat/>
     <w:pPr>
       <w:widowControl/>
+      <w:suppressAutoHyphens w:val="true"/>
       <w:bidi w:val="0"/>
       <w:spacing w:before="0" w:after="0"/>
       <w:jc w:val="start"/>
@@ -9556,7 +9753,7 @@
   </w:style>
   <w:style w:type="paragraph" w:styleId="Heading1">
     <w:name w:val="heading 1"/>
-    <w:basedOn w:val="Ttulo"/>
+    <w:basedOn w:val="Ttulouser"/>
     <w:qFormat/>
     <w:pPr>
       <w:spacing w:before="400" w:after="200"/>
@@ -9573,7 +9770,7 @@
   </w:style>
   <w:style w:type="paragraph" w:styleId="Heading2">
     <w:name w:val="heading 2"/>
-    <w:basedOn w:val="Ttulo"/>
+    <w:basedOn w:val="Ttulouser"/>
     <w:qFormat/>
     <w:pPr>
       <w:spacing w:before="280" w:after="120"/>
@@ -9590,7 +9787,7 @@
   </w:style>
   <w:style w:type="paragraph" w:styleId="Heading3">
     <w:name w:val="heading 3"/>
-    <w:basedOn w:val="Ttulo"/>
+    <w:basedOn w:val="Ttulouser"/>
     <w:qFormat/>
     <w:pPr>
       <w:spacing w:before="200" w:after="80"/>
@@ -9607,7 +9804,7 @@
   </w:style>
   <w:style w:type="paragraph" w:styleId="Heading4">
     <w:name w:val="heading 4"/>
-    <w:basedOn w:val="Ttulo"/>
+    <w:basedOn w:val="Ttulouser"/>
     <w:qFormat/>
     <w:pPr/>
     <w:rPr>
@@ -9618,7 +9815,7 @@
   </w:style>
   <w:style w:type="paragraph" w:styleId="Heading5">
     <w:name w:val="heading 5"/>
-    <w:basedOn w:val="Ttulo"/>
+    <w:basedOn w:val="Ttulouser"/>
     <w:qFormat/>
     <w:pPr/>
     <w:rPr>
@@ -9627,7 +9824,7 @@
   </w:style>
   <w:style w:type="paragraph" w:styleId="Heading6">
     <w:name w:val="heading 6"/>
-    <w:basedOn w:val="Ttulo"/>
+    <w:basedOn w:val="Ttulouser"/>
     <w:qFormat/>
     <w:pPr/>
     <w:rPr>
@@ -9643,11 +9840,18 @@
       <w:u w:val="single"/>
     </w:rPr>
   </w:style>
-  <w:style w:type="character" w:styleId="Caracteresdenotaderodap">
-    <w:name w:val="Caracteres de nota de rodapé"/>
+  <w:style w:type="character" w:styleId="Caracteresdenotaderodapuser">
+    <w:name w:val="Caracteres de nota de rodapé (user)"/>
     <w:uiPriority w:val="99"/>
     <w:semiHidden/>
     <w:unhideWhenUsed/>
+    <w:qFormat/>
+    <w:rPr>
+      <w:vertAlign w:val="superscript"/>
+    </w:rPr>
+  </w:style>
+  <w:style w:type="character" w:styleId="Caracteresdenotaderodap">
+    <w:name w:val="Caracteres de nota de rodapé"/>
     <w:qFormat/>
     <w:rPr>
       <w:vertAlign w:val="superscript"/>
@@ -9670,11 +9874,18 @@
       <w:szCs w:val="20"/>
     </w:rPr>
   </w:style>
-  <w:style w:type="character" w:styleId="Caracteresdenotadefim">
-    <w:name w:val="Caracteres de nota de fim"/>
+  <w:style w:type="character" w:styleId="Caracteresdenotadefimuser">
+    <w:name w:val="Caracteres de nota de fim (user)"/>
     <w:uiPriority w:val="99"/>
     <w:semiHidden/>
     <w:unhideWhenUsed/>
+    <w:qFormat/>
+    <w:rPr>
+      <w:vertAlign w:val="superscript"/>
+    </w:rPr>
+  </w:style>
+  <w:style w:type="character" w:styleId="Caracteresdenotadefim">
+    <w:name w:val="Caracteres de nota de fim"/>
     <w:qFormat/>
     <w:rPr>
       <w:vertAlign w:val="superscript"/>
@@ -9762,9 +9973,35 @@
       <w:rFonts w:cs="Arial"/>
     </w:rPr>
   </w:style>
+  <w:style w:type="paragraph" w:styleId="Ttulouser">
+    <w:name w:val="Título (user)"/>
+    <w:basedOn w:val="Normal"/>
+    <w:next w:val="BodyText"/>
+    <w:qFormat/>
+    <w:pPr>
+      <w:keepNext w:val="true"/>
+      <w:spacing w:before="240" w:after="120"/>
+    </w:pPr>
+    <w:rPr>
+      <w:rFonts w:ascii="Liberation Sans" w:hAnsi="Liberation Sans" w:eastAsia="Microsoft YaHei" w:cs="Arial"/>
+      <w:sz w:val="28"/>
+      <w:szCs w:val="28"/>
+    </w:rPr>
+  </w:style>
+  <w:style w:type="paragraph" w:styleId="ndiceuser">
+    <w:name w:val="Índice (user)"/>
+    <w:basedOn w:val="Normal"/>
+    <w:qFormat/>
+    <w:pPr>
+      <w:suppressLineNumbers/>
+    </w:pPr>
+    <w:rPr>
+      <w:rFonts w:cs="Arial"/>
+    </w:rPr>
+  </w:style>
   <w:style w:type="paragraph" w:styleId="Title">
     <w:name w:val="Title"/>
-    <w:basedOn w:val="Ttulo"/>
+    <w:basedOn w:val="Ttulouser"/>
     <w:qFormat/>
     <w:pPr/>
     <w:rPr>
@@ -9777,6 +10014,7 @@
     <w:qFormat/>
     <w:pPr>
       <w:widowControl/>
+      <w:suppressAutoHyphens w:val="true"/>
       <w:bidi w:val="0"/>
       <w:spacing w:before="0" w:after="0"/>
       <w:jc w:val="start"/>
@@ -9797,6 +10035,7 @@
     <w:qFormat/>
     <w:pPr>
       <w:widowControl/>
+      <w:suppressAutoHyphens w:val="true"/>
       <w:bidi w:val="0"/>
       <w:spacing w:before="0" w:after="0"/>
       <w:jc w:val="start"/>

</xml_diff>